<commit_message>
feat(wingman): integrate room design workflows and catalogue revision
</commit_message>
<xml_diff>
--- a/docs/release-evidence/proposal-output-parity/latest/proposal.docx
+++ b/docs/release-evidence/proposal-output-parity/latest/proposal.docx
@@ -119,6 +119,108 @@
           <w:szCs w:val="22"/>
         </w:rPr>
         <w:t xml:space="preserve">Route two operator sources to four displays with resilient 4K distribution.</w:t>
+      </w:r>
+    </w:p>
+    <w:p>
+      <w:pPr>
+        <w:pStyle w:val="Heading1"/>
+        <w:keepNext/>
+        <w:spacing w:after="200" w:before="360"/>
+      </w:pPr>
+      <w:r>
+        <w:rPr>
+          <w:rFonts w:ascii="Calibri" w:cs="Calibri" w:eastAsia="Calibri" w:hAnsi="Calibri"/>
+          <w:b/>
+          <w:bCs/>
+          <w:color w:val="2E74B5"/>
+          <w:sz w:val="32"/>
+          <w:szCs w:val="32"/>
+        </w:rPr>
+        <w:t xml:space="preserve">Solution Overview</w:t>
+      </w:r>
+    </w:p>
+    <w:p>
+      <w:pPr>
+        <w:spacing w:after="160" w:line="320"/>
+        <w:jc w:val="both"/>
+      </w:pPr>
+      <w:r>
+        <w:rPr>
+          <w:rFonts w:ascii="Calibri" w:cs="Calibri" w:eastAsia="Calibri" w:hAnsi="Calibri"/>
+          <w:color w:val="172B3A"/>
+          <w:sz w:val="22"/>
+          <w:szCs w:val="22"/>
+        </w:rPr>
+        <w:t xml:space="preserve">NetworkHD 600 resilient AV-over-IP fabric</w:t>
+      </w:r>
+    </w:p>
+    <w:p>
+      <w:pPr>
+        <w:pStyle w:val="Heading2"/>
+        <w:keepNext/>
+        <w:spacing w:after="120" w:before="240"/>
+      </w:pPr>
+      <w:r>
+        <w:rPr>
+          <w:rFonts w:ascii="Calibri" w:cs="Calibri" w:eastAsia="Calibri" w:hAnsi="Calibri"/>
+          <w:b/>
+          <w:bCs/>
+          <w:color w:val="08223A"/>
+          <w:sz w:val="26"/>
+          <w:szCs w:val="26"/>
+        </w:rPr>
+        <w:t xml:space="preserve">How the solution will work</w:t>
+      </w:r>
+    </w:p>
+    <w:p>
+      <w:pPr>
+        <w:spacing w:after="160" w:line="320"/>
+      </w:pPr>
+      <w:r>
+        <w:rPr>
+          <w:rFonts w:ascii="Calibri" w:cs="Calibri" w:eastAsia="Calibri" w:hAnsi="Calibri"/>
+          <w:color w:val="172B3A"/>
+          <w:sz w:val="22"/>
+          <w:szCs w:val="22"/>
+        </w:rPr>
+        <w:t xml:space="preserve">The proposed AV-over-IP system distributes content between the scheduled endpoints over a suitably designed network. This allows the agreed destinations to share sources, with any future expansion subject to endpoint compatibility, switch capacity and licensing requirements.</w:t>
+      </w:r>
+    </w:p>
+    <w:p>
+      <w:pPr>
+        <w:pStyle w:val="Heading2"/>
+        <w:keepNext/>
+        <w:spacing w:after="120" w:before="240"/>
+      </w:pPr>
+      <w:r>
+        <w:rPr>
+          <w:rFonts w:ascii="Calibri" w:cs="Calibri" w:eastAsia="Calibri" w:hAnsi="Calibri"/>
+          <w:b/>
+          <w:bCs/>
+          <w:color w:val="08223A"/>
+          <w:sz w:val="26"/>
+          <w:szCs w:val="26"/>
+        </w:rPr>
+        <w:t xml:space="preserve">What successful delivery looks like</w:t>
+      </w:r>
+    </w:p>
+    <w:p>
+      <w:pPr>
+        <w:pStyle w:val="ListParagraph"/>
+        <w:numPr>
+          <w:ilvl w:val="0"/>
+          <w:numId w:val="2"/>
+        </w:numPr>
+        <w:spacing w:after="80" w:line="290"/>
+      </w:pPr>
+      <w:r>
+        <w:rPr>
+          <w:rFonts w:ascii="Calibri" w:cs="Calibri" w:eastAsia="Calibri" w:hAnsi="Calibri"/>
+          <w:color w:val="172B3A"/>
+          <w:sz w:val="22"/>
+          <w:szCs w:val="22"/>
+        </w:rPr>
+        <w:t xml:space="preserve">Every approved source-to-display route passes functional testing.</w:t>
       </w:r>
     </w:p>
     <w:p>
@@ -2372,6 +2474,171 @@
           <w:sz w:val="32"/>
           <w:szCs w:val="32"/>
         </w:rPr>
+        <w:t xml:space="preserve">Complete System Design and Responsibilities</w:t>
+      </w:r>
+    </w:p>
+    <w:p>
+      <w:pPr>
+        <w:spacing w:after="160" w:line="320"/>
+      </w:pPr>
+      <w:r>
+        <w:rPr>
+          <w:rFonts w:ascii="Calibri" w:cs="Calibri" w:eastAsia="Calibri" w:hAnsi="Calibri"/>
+          <w:color w:val="172B3A"/>
+          <w:sz w:val="22"/>
+          <w:szCs w:val="22"/>
+        </w:rPr>
+        <w:t xml:space="preserve">The following items complete the wider solution. Unfilled entries are open design decisions, not supplied equipment or agreed services. Replace each [complete] with the agreed detail or mark it not applicable / excluded.</w:t>
+      </w:r>
+    </w:p>
+    <w:p>
+      <w:pPr>
+        <w:pStyle w:val="ListParagraph"/>
+        <w:numPr>
+          <w:ilvl w:val="0"/>
+          <w:numId w:val="2"/>
+        </w:numPr>
+        <w:spacing w:after="80" w:line="290"/>
+      </w:pPr>
+      <w:r>
+        <w:rPr>
+          <w:rFonts w:ascii="Calibri" w:cs="Calibri" w:eastAsia="Calibri" w:hAnsi="Calibri"/>
+          <w:color w:val="172B3A"/>
+          <w:sz w:val="22"/>
+          <w:szCs w:val="22"/>
+        </w:rPr>
+        <w:t xml:space="preserve">Displays / projection | Model, size, location and mounting: [complete] | Supplier / owner: [complete]</w:t>
+      </w:r>
+    </w:p>
+    <w:p>
+      <w:pPr>
+        <w:pStyle w:val="ListParagraph"/>
+        <w:numPr>
+          <w:ilvl w:val="0"/>
+          <w:numId w:val="2"/>
+        </w:numPr>
+        <w:spacing w:after="80" w:line="290"/>
+      </w:pPr>
+      <w:r>
+        <w:rPr>
+          <w:rFonts w:ascii="Calibri" w:cs="Calibri" w:eastAsia="Calibri" w:hAnsi="Calibri"/>
+          <w:color w:val="172B3A"/>
+          <w:sz w:val="22"/>
+          <w:szCs w:val="22"/>
+        </w:rPr>
+        <w:t xml:space="preserve">Sources and conferencing | Source devices, meeting platform and USB host: [complete] | Supplier / owner: [complete]</w:t>
+      </w:r>
+    </w:p>
+    <w:p>
+      <w:pPr>
+        <w:pStyle w:val="ListParagraph"/>
+        <w:numPr>
+          <w:ilvl w:val="0"/>
+          <w:numId w:val="2"/>
+        </w:numPr>
+        <w:spacing w:after="80" w:line="290"/>
+      </w:pPr>
+      <w:r>
+        <w:rPr>
+          <w:rFonts w:ascii="Calibri" w:cs="Calibri" w:eastAsia="Calibri" w:hAnsi="Calibri"/>
+          <w:color w:val="172B3A"/>
+          <w:sz w:val="22"/>
+          <w:szCs w:val="22"/>
+        </w:rPr>
+        <w:t xml:space="preserve">Audio | Microphones, loudspeakers, DSP and acoustic requirements: [complete] | Supplier / owner: [complete]</w:t>
+      </w:r>
+    </w:p>
+    <w:p>
+      <w:pPr>
+        <w:pStyle w:val="ListParagraph"/>
+        <w:numPr>
+          <w:ilvl w:val="0"/>
+          <w:numId w:val="2"/>
+        </w:numPr>
+        <w:spacing w:after="80" w:line="290"/>
+      </w:pPr>
+      <w:r>
+        <w:rPr>
+          <w:rFonts w:ascii="Calibri" w:cs="Calibri" w:eastAsia="Calibri" w:hAnsi="Calibri"/>
+          <w:color w:val="172B3A"/>
+          <w:sz w:val="22"/>
+          <w:szCs w:val="22"/>
+        </w:rPr>
+        <w:t xml:space="preserve">Network | Switches, port capacity, PoE budget, VLANs and IT approval: [complete] | Supplier / owner: [complete]</w:t>
+      </w:r>
+    </w:p>
+    <w:p>
+      <w:pPr>
+        <w:pStyle w:val="ListParagraph"/>
+        <w:numPr>
+          <w:ilvl w:val="0"/>
+          <w:numId w:val="2"/>
+        </w:numPr>
+        <w:spacing w:after="80" w:line="290"/>
+      </w:pPr>
+      <w:r>
+        <w:rPr>
+          <w:rFonts w:ascii="Calibri" w:cs="Calibri" w:eastAsia="Calibri" w:hAnsi="Calibri"/>
+          <w:color w:val="172B3A"/>
+          <w:sz w:val="22"/>
+          <w:szCs w:val="22"/>
+        </w:rPr>
+        <w:t xml:space="preserve">Control | User interface, named room modes and programming: [complete] | Supplier / owner: [complete]</w:t>
+      </w:r>
+    </w:p>
+    <w:p>
+      <w:pPr>
+        <w:pStyle w:val="ListParagraph"/>
+        <w:numPr>
+          <w:ilvl w:val="0"/>
+          <w:numId w:val="2"/>
+        </w:numPr>
+        <w:spacing w:after="80" w:line="290"/>
+      </w:pPr>
+      <w:r>
+        <w:rPr>
+          <w:rFonts w:ascii="Calibri" w:cs="Calibri" w:eastAsia="Calibri" w:hAnsi="Calibri"/>
+          <w:color w:val="172B3A"/>
+          <w:sz w:val="22"/>
+          <w:szCs w:val="22"/>
+        </w:rPr>
+        <w:t xml:space="preserve">Site infrastructure | Cable routes / distances, rack, ventilation, power and containment: [complete] | Supplier / owner: [complete]</w:t>
+      </w:r>
+    </w:p>
+    <w:p>
+      <w:pPr>
+        <w:pStyle w:val="ListParagraph"/>
+        <w:numPr>
+          <w:ilvl w:val="0"/>
+          <w:numId w:val="2"/>
+        </w:numPr>
+        <w:spacing w:after="80" w:line="290"/>
+      </w:pPr>
+      <w:r>
+        <w:rPr>
+          <w:rFonts w:ascii="Calibri" w:cs="Calibri" w:eastAsia="Calibri" w:hAnsi="Calibri"/>
+          <w:color w:val="172B3A"/>
+          <w:sz w:val="22"/>
+          <w:szCs w:val="22"/>
+        </w:rPr>
+        <w:t xml:space="preserve">Delivery and acceptance | Installation, training, support, acceptance tests and dates: [complete] | Supplier / owner: [complete]</w:t>
+      </w:r>
+    </w:p>
+    <w:p>
+      <w:pPr>
+        <w:pStyle w:val="Heading1"/>
+        <w:keepNext/>
+        <w:spacing w:after="200" w:before="360"/>
+      </w:pPr>
+      <w:r>
+        <w:rPr>
+          <w:rFonts w:ascii="Calibri" w:cs="Calibri" w:eastAsia="Calibri" w:hAnsi="Calibri"/>
+          <w:b/>
+          <w:bCs/>
+          <w:color w:val="2E74B5"/>
+          <w:sz w:val="32"/>
+          <w:szCs w:val="32"/>
+        </w:rPr>
         <w:t xml:space="preserve">Third-Party System Scope</w:t>
       </w:r>
     </w:p>
@@ -2717,6 +2984,20 @@
         <w:t xml:space="preserve">Operator sources → NetworkHD encoders → 10GbE network → NetworkHD decoders → Four displays</w:t>
       </w:r>
     </w:p>
+    <w:p>
+      <w:pPr>
+        <w:spacing w:after="160" w:line="320"/>
+      </w:pPr>
+      <w:r>
+        <w:rPr>
+          <w:rFonts w:ascii="Calibri" w:cs="Calibri" w:eastAsia="Calibri" w:hAnsi="Calibri"/>
+          <w:color w:val="5E7280"/>
+          <w:sz w:val="22"/>
+          <w:szCs w:val="22"/>
+        </w:rPr>
+        <w:t xml:space="preserve">Concept signal-flow diagram: confirm physical connections, cable routes, third-party interfaces and operating modes before installation.</w:t>
+      </w:r>
+    </w:p>
     <w:tbl>
       <w:tblPr>
         <w:tblW w:type="dxa" w:w="9360"/>
@@ -3101,7 +3382,7 @@
           <w:sz w:val="22"/>
           <w:szCs w:val="22"/>
         </w:rPr>
-        <w:t xml:space="preserve">The cable schedule below lists every connection in the recommended system, derived from the native topology-aware schematic engine. Each row shows the transport type, maximum cable length, connector format, and validation status. 7 of 16 runs are confirmed from governed product data; 9 require site confirmation; 0 are not yet confirmed.</w:t>
+        <w:t xml:space="preserve">The cable schedule below lists every connection in the recommended system, derived from the native topology-aware schematic engine. Each row shows the transport type, maximum cable length, connector format, and validation status. 0 of 14 runs are confirmed from governed product data; 14 require site confirmation; 0 are not yet confirmed.</w:t>
       </w:r>
     </w:p>
     <w:tbl>
@@ -3322,7 +3603,7 @@
                 <w:sz w:val="18"/>
                 <w:szCs w:val="18"/>
               </w:rPr>
-              <w:t xml:space="preserve">NHD-600-TX → NHD-600-TX</w:t>
+              <w:t xml:space="preserve">Source 1 (confirm) → NHD-600-TX</w:t>
             </w:r>
           </w:p>
         </w:tc>
@@ -3397,7 +3678,7 @@
                 <w:sz w:val="18"/>
                 <w:szCs w:val="18"/>
               </w:rPr>
-              <w:t xml:space="preserve">HDMI-A to HDMI-A</w:t>
+              <w:t xml:space="preserve">SOURCE PORT TBD to HDMI IN</w:t>
             </w:r>
           </w:p>
         </w:tc>
@@ -3422,7 +3703,7 @@
                 <w:sz w:val="18"/>
                 <w:szCs w:val="18"/>
               </w:rPr>
-              <w:t xml:space="preserve">Confirmed</w:t>
+              <w:t xml:space="preserve">Needs site confirmation</w:t>
             </w:r>
           </w:p>
         </w:tc>
@@ -3476,7 +3757,7 @@
                 <w:sz w:val="18"/>
                 <w:szCs w:val="18"/>
               </w:rPr>
-              <w:t xml:space="preserve">NHD-600-TX → NHD-600-TX</w:t>
+              <w:t xml:space="preserve">Source 2 (confirm) → NHD-600-TX</w:t>
             </w:r>
           </w:p>
         </w:tc>
@@ -3551,7 +3832,7 @@
                 <w:sz w:val="18"/>
                 <w:szCs w:val="18"/>
               </w:rPr>
-              <w:t xml:space="preserve">HDMI-A to HDMI-A</w:t>
+              <w:t xml:space="preserve">SOURCE PORT TBD to HDMI IN</w:t>
             </w:r>
           </w:p>
         </w:tc>
@@ -3576,7 +3857,7 @@
                 <w:sz w:val="18"/>
                 <w:szCs w:val="18"/>
               </w:rPr>
-              <w:t xml:space="preserve">Confirmed</w:t>
+              <w:t xml:space="preserve">Needs site confirmation</w:t>
             </w:r>
           </w:p>
         </w:tc>
@@ -3680,7 +3961,7 @@
                 <w:sz w:val="18"/>
                 <w:szCs w:val="18"/>
               </w:rPr>
-              <w:t xml:space="preserve">Unlimited</w:t>
+              <w:t xml:space="preserve">Not confirmed</w:t>
             </w:r>
           </w:p>
         </w:tc>
@@ -3705,7 +3986,7 @@
                 <w:sz w:val="18"/>
                 <w:szCs w:val="18"/>
               </w:rPr>
-              <w:t xml:space="preserve">RJ45 to RJ45</w:t>
+              <w:t xml:space="preserve">AV LAN (confirm) to SWITCH PORT 1</w:t>
             </w:r>
           </w:p>
         </w:tc>
@@ -3834,7 +4115,7 @@
                 <w:sz w:val="18"/>
                 <w:szCs w:val="18"/>
               </w:rPr>
-              <w:t xml:space="preserve">Unlimited</w:t>
+              <w:t xml:space="preserve">Not confirmed</w:t>
             </w:r>
           </w:p>
         </w:tc>
@@ -3859,7 +4140,7 @@
                 <w:sz w:val="18"/>
                 <w:szCs w:val="18"/>
               </w:rPr>
-              <w:t xml:space="preserve">RJ45 to RJ45</w:t>
+              <w:t xml:space="preserve">AV LAN (confirm) to SWITCH PORT 2</w:t>
             </w:r>
           </w:p>
         </w:tc>
@@ -3938,7 +4219,7 @@
                 <w:sz w:val="18"/>
                 <w:szCs w:val="18"/>
               </w:rPr>
-              <w:t xml:space="preserve">NHD-600-RX → Network switch</w:t>
+              <w:t xml:space="preserve">Network switch → NHD-600-RX</w:t>
             </w:r>
           </w:p>
         </w:tc>
@@ -3988,7 +4269,7 @@
                 <w:sz w:val="18"/>
                 <w:szCs w:val="18"/>
               </w:rPr>
-              <w:t xml:space="preserve">Unlimited</w:t>
+              <w:t xml:space="preserve">Not confirmed</w:t>
             </w:r>
           </w:p>
         </w:tc>
@@ -4013,7 +4294,7 @@
                 <w:sz w:val="18"/>
                 <w:szCs w:val="18"/>
               </w:rPr>
-              <w:t xml:space="preserve">RJ45 to RJ45</w:t>
+              <w:t xml:space="preserve">SWITCH PORT 3 to AV LAN (confirm)</w:t>
             </w:r>
           </w:p>
         </w:tc>
@@ -4092,7 +4373,7 @@
                 <w:sz w:val="18"/>
                 <w:szCs w:val="18"/>
               </w:rPr>
-              <w:t xml:space="preserve">NHD-600-RX → Network switch</w:t>
+              <w:t xml:space="preserve">Network switch → NHD-600-RX</w:t>
             </w:r>
           </w:p>
         </w:tc>
@@ -4142,7 +4423,7 @@
                 <w:sz w:val="18"/>
                 <w:szCs w:val="18"/>
               </w:rPr>
-              <w:t xml:space="preserve">Unlimited</w:t>
+              <w:t xml:space="preserve">Not confirmed</w:t>
             </w:r>
           </w:p>
         </w:tc>
@@ -4167,7 +4448,7 @@
                 <w:sz w:val="18"/>
                 <w:szCs w:val="18"/>
               </w:rPr>
-              <w:t xml:space="preserve">RJ45 to RJ45</w:t>
+              <w:t xml:space="preserve">SWITCH PORT 4 to AV LAN (confirm)</w:t>
             </w:r>
           </w:p>
         </w:tc>
@@ -4246,7 +4527,7 @@
                 <w:sz w:val="18"/>
                 <w:szCs w:val="18"/>
               </w:rPr>
-              <w:t xml:space="preserve">NHD-600-RX → Network switch</w:t>
+              <w:t xml:space="preserve">Network switch → NHD-600-RX</w:t>
             </w:r>
           </w:p>
         </w:tc>
@@ -4296,7 +4577,7 @@
                 <w:sz w:val="18"/>
                 <w:szCs w:val="18"/>
               </w:rPr>
-              <w:t xml:space="preserve">Unlimited</w:t>
+              <w:t xml:space="preserve">Not confirmed</w:t>
             </w:r>
           </w:p>
         </w:tc>
@@ -4321,7 +4602,7 @@
                 <w:sz w:val="18"/>
                 <w:szCs w:val="18"/>
               </w:rPr>
-              <w:t xml:space="preserve">RJ45 to RJ45</w:t>
+              <w:t xml:space="preserve">SWITCH PORT 5 to AV LAN (confirm)</w:t>
             </w:r>
           </w:p>
         </w:tc>
@@ -4400,7 +4681,7 @@
                 <w:sz w:val="18"/>
                 <w:szCs w:val="18"/>
               </w:rPr>
-              <w:t xml:space="preserve">NHD-600-RX → Network switch</w:t>
+              <w:t xml:space="preserve">Network switch → NHD-600-RX</w:t>
             </w:r>
           </w:p>
         </w:tc>
@@ -4450,7 +4731,7 @@
                 <w:sz w:val="18"/>
                 <w:szCs w:val="18"/>
               </w:rPr>
-              <w:t xml:space="preserve">Unlimited</w:t>
+              <w:t xml:space="preserve">Not confirmed</w:t>
             </w:r>
           </w:p>
         </w:tc>
@@ -4475,7 +4756,7 @@
                 <w:sz w:val="18"/>
                 <w:szCs w:val="18"/>
               </w:rPr>
-              <w:t xml:space="preserve">RJ45 to RJ45</w:t>
+              <w:t xml:space="preserve">SWITCH PORT 6 to AV LAN (confirm)</w:t>
             </w:r>
           </w:p>
         </w:tc>
@@ -4604,7 +4885,7 @@
                 <w:sz w:val="18"/>
                 <w:szCs w:val="18"/>
               </w:rPr>
-              <w:t xml:space="preserve">Unlimited</w:t>
+              <w:t xml:space="preserve">Not confirmed</w:t>
             </w:r>
           </w:p>
         </w:tc>
@@ -4629,7 +4910,7 @@
                 <w:sz w:val="18"/>
                 <w:szCs w:val="18"/>
               </w:rPr>
-              <w:t xml:space="preserve">RJ45 to RJ45</w:t>
+              <w:t xml:space="preserve">AV LAN (confirm) to SWITCH PORT 7</w:t>
             </w:r>
           </w:p>
         </w:tc>
@@ -4708,7 +4989,7 @@
                 <w:sz w:val="18"/>
                 <w:szCs w:val="18"/>
               </w:rPr>
-              <w:t xml:space="preserve">NHD-600-RX → NHD-600-RX</w:t>
+              <w:t xml:space="preserve">NHD-600-RX → Display 1 (confirm)</w:t>
             </w:r>
           </w:p>
         </w:tc>
@@ -4783,7 +5064,7 @@
                 <w:sz w:val="18"/>
                 <w:szCs w:val="18"/>
               </w:rPr>
-              <w:t xml:space="preserve">HDMI-A to HDMI-A</w:t>
+              <w:t xml:space="preserve">HDMI OUT to DISPLAY INPUT (confirm)</w:t>
             </w:r>
           </w:p>
         </w:tc>
@@ -4808,7 +5089,7 @@
                 <w:sz w:val="18"/>
                 <w:szCs w:val="18"/>
               </w:rPr>
-              <w:t xml:space="preserve">Confirmed</w:t>
+              <w:t xml:space="preserve">Needs site confirmation</w:t>
             </w:r>
           </w:p>
         </w:tc>
@@ -4862,7 +5143,7 @@
                 <w:sz w:val="18"/>
                 <w:szCs w:val="18"/>
               </w:rPr>
-              <w:t xml:space="preserve">NHD-600-RX → NHD-600-RX</w:t>
+              <w:t xml:space="preserve">NHD-600-RX → Display 2 (confirm)</w:t>
             </w:r>
           </w:p>
         </w:tc>
@@ -4937,7 +5218,7 @@
                 <w:sz w:val="18"/>
                 <w:szCs w:val="18"/>
               </w:rPr>
-              <w:t xml:space="preserve">HDMI-A to HDMI-A</w:t>
+              <w:t xml:space="preserve">HDMI OUT to DISPLAY INPUT (confirm)</w:t>
             </w:r>
           </w:p>
         </w:tc>
@@ -4962,7 +5243,7 @@
                 <w:sz w:val="18"/>
                 <w:szCs w:val="18"/>
               </w:rPr>
-              <w:t xml:space="preserve">Confirmed</w:t>
+              <w:t xml:space="preserve">Needs site confirmation</w:t>
             </w:r>
           </w:p>
         </w:tc>
@@ -5016,7 +5297,7 @@
                 <w:sz w:val="18"/>
                 <w:szCs w:val="18"/>
               </w:rPr>
-              <w:t xml:space="preserve">NHD-600-RX → NHD-600-RX</w:t>
+              <w:t xml:space="preserve">NHD-600-RX → Display 3 (confirm)</w:t>
             </w:r>
           </w:p>
         </w:tc>
@@ -5091,7 +5372,7 @@
                 <w:sz w:val="18"/>
                 <w:szCs w:val="18"/>
               </w:rPr>
-              <w:t xml:space="preserve">HDMI-A to HDMI-A</w:t>
+              <w:t xml:space="preserve">HDMI OUT to DISPLAY INPUT (confirm)</w:t>
             </w:r>
           </w:p>
         </w:tc>
@@ -5116,7 +5397,7 @@
                 <w:sz w:val="18"/>
                 <w:szCs w:val="18"/>
               </w:rPr>
-              <w:t xml:space="preserve">Confirmed</w:t>
+              <w:t xml:space="preserve">Needs site confirmation</w:t>
             </w:r>
           </w:p>
         </w:tc>
@@ -5170,7 +5451,7 @@
                 <w:sz w:val="18"/>
                 <w:szCs w:val="18"/>
               </w:rPr>
-              <w:t xml:space="preserve">NHD-600-RX → NHD-600-RX</w:t>
+              <w:t xml:space="preserve">NHD-600-RX → Display 4 (confirm)</w:t>
             </w:r>
           </w:p>
         </w:tc>
@@ -5245,7 +5526,7 @@
                 <w:sz w:val="18"/>
                 <w:szCs w:val="18"/>
               </w:rPr>
-              <w:t xml:space="preserve">HDMI-A to HDMI-A</w:t>
+              <w:t xml:space="preserve">HDMI OUT to DISPLAY INPUT (confirm)</w:t>
             </w:r>
           </w:p>
         </w:tc>
@@ -5270,7 +5551,7 @@
                 <w:sz w:val="18"/>
                 <w:szCs w:val="18"/>
               </w:rPr>
-              <w:t xml:space="preserve">Confirmed</w:t>
+              <w:t xml:space="preserve">Needs site confirmation</w:t>
             </w:r>
           </w:p>
         </w:tc>
@@ -5324,7 +5605,7 @@
                 <w:sz w:val="18"/>
                 <w:szCs w:val="18"/>
               </w:rPr>
-              <w:t xml:space="preserve">Control system → NHD-600-TX</w:t>
+              <w:t xml:space="preserve">AV network infrastructure</w:t>
             </w:r>
           </w:p>
         </w:tc>
@@ -5349,7 +5630,7 @@
                 <w:sz w:val="18"/>
                 <w:szCs w:val="18"/>
               </w:rPr>
-              <w:t xml:space="preserve">Control</w:t>
+              <w:t xml:space="preserve">Network / AVoIP</w:t>
             </w:r>
           </w:p>
         </w:tc>
@@ -5374,7 +5655,7 @@
                 <w:sz w:val="18"/>
                 <w:szCs w:val="18"/>
               </w:rPr>
-              <w:t xml:space="preserve">100m</w:t>
+              <w:t xml:space="preserve">Not confirmed</w:t>
             </w:r>
           </w:p>
         </w:tc>
@@ -5399,7 +5680,7 @@
                 <w:sz w:val="18"/>
                 <w:szCs w:val="18"/>
               </w:rPr>
-              <w:t xml:space="preserve">DB-9 / IR / RJ45</w:t>
+              <w:t xml:space="preserve">RJ45 to RJ45</w:t>
             </w:r>
           </w:p>
         </w:tc>
@@ -5424,7 +5705,7 @@
                 <w:sz w:val="18"/>
                 <w:szCs w:val="18"/>
               </w:rPr>
-              <w:t xml:space="preserve">Confirmed</w:t>
+              <w:t xml:space="preserve">Needs site confirmation</w:t>
             </w:r>
           </w:p>
         </w:tc>
@@ -5449,320 +5730,210 @@
                 <w:sz w:val="18"/>
                 <w:szCs w:val="18"/>
               </w:rPr>
-              <w:t xml:space="preserve">Confirm control protocol (RS-232/IR/IP), baud rate, pinout, cable routing, and control processor compatibility.</w:t>
-            </w:r>
-          </w:p>
-        </w:tc>
-      </w:tr>
-      <w:tr>
-        <w:tc>
-          <w:tcPr>
-            <w:tcW w:type="dxa" w:w="2000"/>
-            <w:tcMar>
-              <w:top w:type="dxa" w:w="80"/>
-              <w:left w:type="dxa" w:w="120"/>
-              <w:bottom w:type="dxa" w:w="80"/>
-              <w:right w:type="dxa" w:w="120"/>
-            </w:tcMar>
-          </w:tcPr>
-          <w:p>
-            <w:pPr>
-              <w:spacing w:after="0" w:line="260"/>
-            </w:pPr>
-            <w:r>
-              <w:rPr>
-                <w:rFonts w:ascii="Calibri" w:cs="Calibri" w:eastAsia="Calibri" w:hAnsi="Calibri"/>
-                <w:b/>
-                <w:bCs/>
-                <w:color w:val="08223A"/>
-                <w:sz w:val="18"/>
-                <w:szCs w:val="18"/>
-              </w:rPr>
-              <w:t xml:space="preserve">AV network infrastructure</w:t>
-            </w:r>
-          </w:p>
-        </w:tc>
-        <w:tc>
-          <w:tcPr>
-            <w:tcW w:type="dxa" w:w="1500"/>
-            <w:tcMar>
-              <w:top w:type="dxa" w:w="80"/>
-              <w:left w:type="dxa" w:w="120"/>
-              <w:bottom w:type="dxa" w:w="80"/>
-              <w:right w:type="dxa" w:w="120"/>
-            </w:tcMar>
-          </w:tcPr>
-          <w:p>
-            <w:pPr>
-              <w:spacing w:after="0" w:line="260"/>
-            </w:pPr>
-            <w:r>
-              <w:rPr>
-                <w:rFonts w:ascii="Calibri" w:cs="Calibri" w:eastAsia="Calibri" w:hAnsi="Calibri"/>
-                <w:color w:val="172B3A"/>
-                <w:sz w:val="18"/>
-                <w:szCs w:val="18"/>
-              </w:rPr>
-              <w:t xml:space="preserve">Network / AVoIP</w:t>
-            </w:r>
-          </w:p>
-        </w:tc>
-        <w:tc>
-          <w:tcPr>
-            <w:tcW w:type="dxa" w:w="900"/>
-            <w:tcMar>
-              <w:top w:type="dxa" w:w="80"/>
-              <w:left w:type="dxa" w:w="120"/>
-              <w:bottom w:type="dxa" w:w="80"/>
-              <w:right w:type="dxa" w:w="120"/>
-            </w:tcMar>
-          </w:tcPr>
-          <w:p>
-            <w:pPr>
-              <w:spacing w:after="0" w:line="260"/>
-            </w:pPr>
-            <w:r>
-              <w:rPr>
-                <w:rFonts w:ascii="Calibri" w:cs="Calibri" w:eastAsia="Calibri" w:hAnsi="Calibri"/>
-                <w:color w:val="172B3A"/>
-                <w:sz w:val="18"/>
-                <w:szCs w:val="18"/>
-              </w:rPr>
-              <w:t xml:space="preserve">Unlimited</w:t>
-            </w:r>
-          </w:p>
-        </w:tc>
-        <w:tc>
-          <w:tcPr>
-            <w:tcW w:type="dxa" w:w="1200"/>
-            <w:tcMar>
-              <w:top w:type="dxa" w:w="80"/>
-              <w:left w:type="dxa" w:w="120"/>
-              <w:bottom w:type="dxa" w:w="80"/>
-              <w:right w:type="dxa" w:w="120"/>
-            </w:tcMar>
-          </w:tcPr>
-          <w:p>
-            <w:pPr>
-              <w:spacing w:after="0" w:line="260"/>
-            </w:pPr>
-            <w:r>
-              <w:rPr>
-                <w:rFonts w:ascii="Calibri" w:cs="Calibri" w:eastAsia="Calibri" w:hAnsi="Calibri"/>
-                <w:color w:val="172B3A"/>
-                <w:sz w:val="18"/>
-                <w:szCs w:val="18"/>
-              </w:rPr>
-              <w:t xml:space="preserve">RJ45 to RJ45</w:t>
-            </w:r>
-          </w:p>
-        </w:tc>
-        <w:tc>
-          <w:tcPr>
-            <w:tcW w:type="dxa" w:w="900"/>
-            <w:tcMar>
-              <w:top w:type="dxa" w:w="80"/>
-              <w:left w:type="dxa" w:w="120"/>
-              <w:bottom w:type="dxa" w:w="80"/>
-              <w:right w:type="dxa" w:w="120"/>
-            </w:tcMar>
-          </w:tcPr>
-          <w:p>
-            <w:pPr>
-              <w:spacing w:after="0" w:line="260"/>
-            </w:pPr>
-            <w:r>
-              <w:rPr>
-                <w:rFonts w:ascii="Calibri" w:cs="Calibri" w:eastAsia="Calibri" w:hAnsi="Calibri"/>
-                <w:color w:val="172B3A"/>
-                <w:sz w:val="18"/>
-                <w:szCs w:val="18"/>
-              </w:rPr>
-              <w:t xml:space="preserve">Needs site confirmation</w:t>
-            </w:r>
-          </w:p>
-        </w:tc>
-        <w:tc>
-          <w:tcPr>
-            <w:tcW w:type="dxa" w:w="2560"/>
-            <w:tcMar>
-              <w:top w:type="dxa" w:w="80"/>
-              <w:left w:type="dxa" w:w="120"/>
-              <w:bottom w:type="dxa" w:w="80"/>
-              <w:right w:type="dxa" w:w="120"/>
-            </w:tcMar>
-          </w:tcPr>
-          <w:p>
-            <w:pPr>
-              <w:spacing w:after="0" w:line="260"/>
-            </w:pPr>
-            <w:r>
-              <w:rPr>
-                <w:rFonts w:ascii="Calibri" w:cs="Calibri" w:eastAsia="Calibri" w:hAnsi="Calibri"/>
-                <w:color w:val="172B3A"/>
-                <w:sz w:val="18"/>
-                <w:szCs w:val="18"/>
-              </w:rPr>
               <w:t xml:space="preserve">Confirm switch model, port count, PoE budget, VLAN configuration, multicast policy, and uplink capacity.</w:t>
-            </w:r>
-          </w:p>
-        </w:tc>
-      </w:tr>
-      <w:tr>
-        <w:tc>
-          <w:tcPr>
-            <w:tcW w:type="dxa" w:w="2000"/>
-            <w:tcMar>
-              <w:top w:type="dxa" w:w="80"/>
-              <w:left w:type="dxa" w:w="120"/>
-              <w:bottom w:type="dxa" w:w="80"/>
-              <w:right w:type="dxa" w:w="120"/>
-            </w:tcMar>
-          </w:tcPr>
-          <w:p>
-            <w:pPr>
-              <w:spacing w:after="0" w:line="260"/>
-            </w:pPr>
-            <w:r>
-              <w:rPr>
-                <w:rFonts w:ascii="Calibri" w:cs="Calibri" w:eastAsia="Calibri" w:hAnsi="Calibri"/>
-                <w:b/>
-                <w:bCs/>
-                <w:color w:val="08223A"/>
-                <w:sz w:val="18"/>
-                <w:szCs w:val="18"/>
-              </w:rPr>
-              <w:t xml:space="preserve">Control system integration</w:t>
-            </w:r>
-          </w:p>
-        </w:tc>
-        <w:tc>
-          <w:tcPr>
-            <w:tcW w:type="dxa" w:w="1500"/>
-            <w:tcMar>
-              <w:top w:type="dxa" w:w="80"/>
-              <w:left w:type="dxa" w:w="120"/>
-              <w:bottom w:type="dxa" w:w="80"/>
-              <w:right w:type="dxa" w:w="120"/>
-            </w:tcMar>
-          </w:tcPr>
-          <w:p>
-            <w:pPr>
-              <w:spacing w:after="0" w:line="260"/>
-            </w:pPr>
-            <w:r>
-              <w:rPr>
-                <w:rFonts w:ascii="Calibri" w:cs="Calibri" w:eastAsia="Calibri" w:hAnsi="Calibri"/>
-                <w:color w:val="172B3A"/>
-                <w:sz w:val="18"/>
-                <w:szCs w:val="18"/>
-              </w:rPr>
-              <w:t xml:space="preserve">Control</w:t>
-            </w:r>
-          </w:p>
-        </w:tc>
-        <w:tc>
-          <w:tcPr>
-            <w:tcW w:type="dxa" w:w="900"/>
-            <w:tcMar>
-              <w:top w:type="dxa" w:w="80"/>
-              <w:left w:type="dxa" w:w="120"/>
-              <w:bottom w:type="dxa" w:w="80"/>
-              <w:right w:type="dxa" w:w="120"/>
-            </w:tcMar>
-          </w:tcPr>
-          <w:p>
-            <w:pPr>
-              <w:spacing w:after="0" w:line="260"/>
-            </w:pPr>
-            <w:r>
-              <w:rPr>
-                <w:rFonts w:ascii="Calibri" w:cs="Calibri" w:eastAsia="Calibri" w:hAnsi="Calibri"/>
-                <w:color w:val="172B3A"/>
-                <w:sz w:val="18"/>
-                <w:szCs w:val="18"/>
-              </w:rPr>
-              <w:t xml:space="preserve">100m</w:t>
-            </w:r>
-          </w:p>
-        </w:tc>
-        <w:tc>
-          <w:tcPr>
-            <w:tcW w:type="dxa" w:w="1200"/>
-            <w:tcMar>
-              <w:top w:type="dxa" w:w="80"/>
-              <w:left w:type="dxa" w:w="120"/>
-              <w:bottom w:type="dxa" w:w="80"/>
-              <w:right w:type="dxa" w:w="120"/>
-            </w:tcMar>
-          </w:tcPr>
-          <w:p>
-            <w:pPr>
-              <w:spacing w:after="0" w:line="260"/>
-            </w:pPr>
-            <w:r>
-              <w:rPr>
-                <w:rFonts w:ascii="Calibri" w:cs="Calibri" w:eastAsia="Calibri" w:hAnsi="Calibri"/>
-                <w:color w:val="172B3A"/>
-                <w:sz w:val="18"/>
-                <w:szCs w:val="18"/>
-              </w:rPr>
-              <w:t xml:space="preserve">DB-9 / IR / RJ45</w:t>
-            </w:r>
-          </w:p>
-        </w:tc>
-        <w:tc>
-          <w:tcPr>
-            <w:tcW w:type="dxa" w:w="900"/>
-            <w:tcMar>
-              <w:top w:type="dxa" w:w="80"/>
-              <w:left w:type="dxa" w:w="120"/>
-              <w:bottom w:type="dxa" w:w="80"/>
-              <w:right w:type="dxa" w:w="120"/>
-            </w:tcMar>
-          </w:tcPr>
-          <w:p>
-            <w:pPr>
-              <w:spacing w:after="0" w:line="260"/>
-            </w:pPr>
-            <w:r>
-              <w:rPr>
-                <w:rFonts w:ascii="Calibri" w:cs="Calibri" w:eastAsia="Calibri" w:hAnsi="Calibri"/>
-                <w:color w:val="172B3A"/>
-                <w:sz w:val="18"/>
-                <w:szCs w:val="18"/>
-              </w:rPr>
-              <w:t xml:space="preserve">Needs site confirmation</w:t>
-            </w:r>
-          </w:p>
-        </w:tc>
-        <w:tc>
-          <w:tcPr>
-            <w:tcW w:type="dxa" w:w="2560"/>
-            <w:tcMar>
-              <w:top w:type="dxa" w:w="80"/>
-              <w:left w:type="dxa" w:w="120"/>
-              <w:bottom w:type="dxa" w:w="80"/>
-              <w:right w:type="dxa" w:w="120"/>
-            </w:tcMar>
-          </w:tcPr>
-          <w:p>
-            <w:pPr>
-              <w:spacing w:after="0" w:line="260"/>
-            </w:pPr>
-            <w:r>
-              <w:rPr>
-                <w:rFonts w:ascii="Calibri" w:cs="Calibri" w:eastAsia="Calibri" w:hAnsi="Calibri"/>
-                <w:color w:val="172B3A"/>
-                <w:sz w:val="18"/>
-                <w:szCs w:val="18"/>
-              </w:rPr>
-              <w:t xml:space="preserve">Define who operates the room and convert engineering routes into user-friendly presets.</w:t>
             </w:r>
           </w:p>
         </w:tc>
       </w:tr>
     </w:tbl>
+    <w:p>
+      <w:pPr>
+        <w:pStyle w:val="Heading1"/>
+        <w:keepNext/>
+        <w:spacing w:after="200" w:before="360"/>
+      </w:pPr>
+      <w:r>
+        <w:rPr>
+          <w:rFonts w:ascii="Calibri" w:cs="Calibri" w:eastAsia="Calibri" w:hAnsi="Calibri"/>
+          <w:b/>
+          <w:bCs/>
+          <w:color w:val="2E74B5"/>
+          <w:sz w:val="32"/>
+          <w:szCs w:val="32"/>
+        </w:rPr>
+        <w:t xml:space="preserve">Products in the Solution</w:t>
+      </w:r>
+    </w:p>
+    <w:p>
+      <w:pPr>
+        <w:pStyle w:val="Heading2"/>
+        <w:keepNext/>
+        <w:spacing w:after="120" w:before="240"/>
+      </w:pPr>
+      <w:r>
+        <w:rPr>
+          <w:rFonts w:ascii="Calibri" w:cs="Calibri" w:eastAsia="Calibri" w:hAnsi="Calibri"/>
+          <w:b/>
+          <w:bCs/>
+          <w:color w:val="08223A"/>
+          <w:sz w:val="26"/>
+          <w:szCs w:val="26"/>
+        </w:rPr>
+        <w:t xml:space="preserve">NHD-600-TX — NetworkHD 600 encoder</w:t>
+      </w:r>
+    </w:p>
+    <w:p>
+      <w:pPr>
+        <w:spacing w:after="160" w:line="320"/>
+      </w:pPr>
+      <w:r>
+        <w:rPr>
+          <w:rFonts w:ascii="Calibri" w:cs="Calibri" w:eastAsia="Calibri" w:hAnsi="Calibri"/>
+          <w:color w:val="5E7280"/>
+          <w:sz w:val="22"/>
+          <w:szCs w:val="22"/>
+        </w:rPr>
+        <w:t xml:space="preserve">Product photograph unavailable.</w:t>
+      </w:r>
+    </w:p>
+    <w:p>
+      <w:pPr>
+        <w:spacing w:after="160" w:line="320"/>
+      </w:pPr>
+      <w:r>
+        <w:rPr>
+          <w:rFonts w:ascii="Calibri" w:cs="Calibri" w:eastAsia="Calibri" w:hAnsi="Calibri"/>
+          <w:color w:val="172B3A"/>
+          <w:sz w:val="22"/>
+          <w:szCs w:val="22"/>
+        </w:rPr>
+        <w:t xml:space="preserve">Role in this design: Encode operator sources</w:t>
+      </w:r>
+    </w:p>
+    <w:p>
+      <w:pPr>
+        <w:spacing w:after="160" w:line="320"/>
+      </w:pPr>
+      <w:r>
+        <w:rPr>
+          <w:rFonts w:ascii="Calibri" w:cs="Calibri" w:eastAsia="Calibri" w:hAnsi="Calibri"/>
+          <w:color w:val="5E7280"/>
+          <w:sz w:val="22"/>
+          <w:szCs w:val="22"/>
+        </w:rPr>
+        <w:t xml:space="preserve">Official product link to be confirmed.</w:t>
+      </w:r>
+    </w:p>
+    <w:p>
+      <w:pPr>
+        <w:pStyle w:val="Heading2"/>
+        <w:keepNext/>
+        <w:spacing w:after="120" w:before="240"/>
+      </w:pPr>
+      <w:r>
+        <w:rPr>
+          <w:rFonts w:ascii="Calibri" w:cs="Calibri" w:eastAsia="Calibri" w:hAnsi="Calibri"/>
+          <w:b/>
+          <w:bCs/>
+          <w:color w:val="08223A"/>
+          <w:sz w:val="26"/>
+          <w:szCs w:val="26"/>
+        </w:rPr>
+        <w:t xml:space="preserve">NHD-600-RX — NetworkHD 600 decoder</w:t>
+      </w:r>
+    </w:p>
+    <w:p>
+      <w:pPr>
+        <w:spacing w:after="160" w:line="320"/>
+      </w:pPr>
+      <w:r>
+        <w:rPr>
+          <w:rFonts w:ascii="Calibri" w:cs="Calibri" w:eastAsia="Calibri" w:hAnsi="Calibri"/>
+          <w:color w:val="5E7280"/>
+          <w:sz w:val="22"/>
+          <w:szCs w:val="22"/>
+        </w:rPr>
+        <w:t xml:space="preserve">Product photograph unavailable.</w:t>
+      </w:r>
+    </w:p>
+    <w:p>
+      <w:pPr>
+        <w:spacing w:after="160" w:line="320"/>
+      </w:pPr>
+      <w:r>
+        <w:rPr>
+          <w:rFonts w:ascii="Calibri" w:cs="Calibri" w:eastAsia="Calibri" w:hAnsi="Calibri"/>
+          <w:color w:val="172B3A"/>
+          <w:sz w:val="22"/>
+          <w:szCs w:val="22"/>
+        </w:rPr>
+        <w:t xml:space="preserve">Role in this design: Decode display feeds</w:t>
+      </w:r>
+    </w:p>
+    <w:p>
+      <w:pPr>
+        <w:spacing w:after="160" w:line="320"/>
+      </w:pPr>
+      <w:r>
+        <w:rPr>
+          <w:rFonts w:ascii="Calibri" w:cs="Calibri" w:eastAsia="Calibri" w:hAnsi="Calibri"/>
+          <w:color w:val="5E7280"/>
+          <w:sz w:val="22"/>
+          <w:szCs w:val="22"/>
+        </w:rPr>
+        <w:t xml:space="preserve">Official product link to be confirmed.</w:t>
+      </w:r>
+    </w:p>
+    <w:p>
+      <w:pPr>
+        <w:pStyle w:val="Heading2"/>
+        <w:keepNext/>
+        <w:spacing w:after="120" w:before="240"/>
+      </w:pPr>
+      <w:r>
+        <w:rPr>
+          <w:rFonts w:ascii="Calibri" w:cs="Calibri" w:eastAsia="Calibri" w:hAnsi="Calibri"/>
+          <w:b/>
+          <w:bCs/>
+          <w:color w:val="08223A"/>
+          <w:sz w:val="26"/>
+          <w:szCs w:val="26"/>
+        </w:rPr>
+        <w:t xml:space="preserve">NHD-CTL-PRO-V2 — NetworkHD controller</w:t>
+      </w:r>
+    </w:p>
+    <w:p>
+      <w:pPr>
+        <w:spacing w:after="160" w:line="320"/>
+      </w:pPr>
+      <w:r>
+        <w:rPr>
+          <w:rFonts w:ascii="Calibri" w:cs="Calibri" w:eastAsia="Calibri" w:hAnsi="Calibri"/>
+          <w:color w:val="5E7280"/>
+          <w:sz w:val="22"/>
+          <w:szCs w:val="22"/>
+        </w:rPr>
+        <w:t xml:space="preserve">Product photograph unavailable.</w:t>
+      </w:r>
+    </w:p>
+    <w:p>
+      <w:pPr>
+        <w:spacing w:after="160" w:line="320"/>
+      </w:pPr>
+      <w:r>
+        <w:rPr>
+          <w:rFonts w:ascii="Calibri" w:cs="Calibri" w:eastAsia="Calibri" w:hAnsi="Calibri"/>
+          <w:color w:val="172B3A"/>
+          <w:sz w:val="22"/>
+          <w:szCs w:val="22"/>
+        </w:rPr>
+        <w:t xml:space="preserve">Role in this design: Routing control</w:t>
+      </w:r>
+    </w:p>
+    <w:p>
+      <w:pPr>
+        <w:spacing w:after="160" w:line="320"/>
+      </w:pPr>
+      <w:r>
+        <w:rPr>
+          <w:rFonts w:ascii="Calibri" w:cs="Calibri" w:eastAsia="Calibri" w:hAnsi="Calibri"/>
+          <w:color w:val="5E7280"/>
+          <w:sz w:val="22"/>
+          <w:szCs w:val="22"/>
+        </w:rPr>
+        <w:t xml:space="preserve">Official product link to be confirmed.</w:t>
+      </w:r>
+    </w:p>
     <w:p>
       <w:pPr>
         <w:pStyle w:val="Heading1"/>
@@ -6689,7 +6860,7 @@
                 <w:sz w:val="18"/>
                 <w:szCs w:val="18"/>
               </w:rPr>
-              <w:t xml:space="preserve">Days 1-3</w:t>
+              <w:t xml:space="preserve">Dates to be agreed</w:t>
             </w:r>
           </w:p>
         </w:tc>
@@ -6791,7 +6962,7 @@
                 <w:sz w:val="18"/>
                 <w:szCs w:val="18"/>
               </w:rPr>
-              <w:t xml:space="preserve">Days 4-7</w:t>
+              <w:t xml:space="preserve">Dates to be agreed</w:t>
             </w:r>
           </w:p>
         </w:tc>
@@ -6893,7 +7064,7 @@
                 <w:sz w:val="18"/>
                 <w:szCs w:val="18"/>
               </w:rPr>
-              <w:t xml:space="preserve">Days 8-10</w:t>
+              <w:t xml:space="preserve">Dates to be agreed</w:t>
             </w:r>
           </w:p>
         </w:tc>
@@ -6995,7 +7166,7 @@
                 <w:sz w:val="18"/>
                 <w:szCs w:val="18"/>
               </w:rPr>
-              <w:t xml:space="preserve">Days 11-12</w:t>
+              <w:t xml:space="preserve">Dates to be agreed</w:t>
             </w:r>
           </w:p>
         </w:tc>
@@ -7020,7 +7191,7 @@
                 <w:sz w:val="18"/>
                 <w:szCs w:val="18"/>
               </w:rPr>
-              <w:t xml:space="preserve">Validate routing, control, audio, USB and failover</w:t>
+              <w:t xml:space="preserve">Validate agreed routing, control, audio and USB workflows</w:t>
             </w:r>
           </w:p>
         </w:tc>
@@ -7097,7 +7268,7 @@
                 <w:sz w:val="18"/>
                 <w:szCs w:val="18"/>
               </w:rPr>
-              <w:t xml:space="preserve">Days 13-14</w:t>
+              <w:t xml:space="preserve">Dates to be agreed</w:t>
             </w:r>
           </w:p>
         </w:tc>

</xml_diff>

<commit_message>
test: harden browser workflows and refresh proposal evidence
</commit_message>
<xml_diff>
--- a/docs/release-evidence/proposal-output-parity/latest/proposal.docx
+++ b/docs/release-evidence/proposal-output-parity/latest/proposal.docx
@@ -136,22 +136,37 @@
           <w:sz w:val="32"/>
           <w:szCs w:val="32"/>
         </w:rPr>
-        <w:t xml:space="preserve">Solution Overview</w:t>
+        <w:t xml:space="preserve">Room at a glance</w:t>
       </w:r>
     </w:p>
     <w:p>
       <w:pPr>
         <w:spacing w:after="160" w:line="320"/>
-        <w:jc w:val="both"/>
-      </w:pPr>
-      <w:r>
-        <w:rPr>
-          <w:rFonts w:ascii="Calibri" w:cs="Calibri" w:eastAsia="Calibri" w:hAnsi="Calibri"/>
+      </w:pPr>
+      <w:r>
+        <w:rPr>
+          <w:rFonts w:ascii="Calibri" w:cs="Calibri" w:eastAsia="Calibri" w:hAnsi="Calibri"/>
+          <w:b/>
+          <w:bCs/>
           <w:color w:val="172B3A"/>
           <w:sz w:val="22"/>
           <w:szCs w:val="22"/>
         </w:rPr>
-        <w:t xml:space="preserve">NetworkHD 600 resilient AV-over-IP fabric</w:t>
+        <w:t xml:space="preserve">Operations room</w:t>
+      </w:r>
+    </w:p>
+    <w:p>
+      <w:pPr>
+        <w:spacing w:after="160" w:line="320"/>
+      </w:pPr>
+      <w:r>
+        <w:rPr>
+          <w:rFonts w:ascii="Calibri" w:cs="Calibri" w:eastAsia="Calibri" w:hAnsi="Calibri"/>
+          <w:color w:val="172B3A"/>
+          <w:sz w:val="22"/>
+          <w:szCs w:val="22"/>
+        </w:rPr>
+        <w:t xml:space="preserve">Route two operator sources to four displays with resilient 4K distribution.</w:t>
       </w:r>
     </w:p>
     <w:p>
@@ -169,7 +184,7 @@
           <w:sz w:val="26"/>
           <w:szCs w:val="26"/>
         </w:rPr>
-        <w:t xml:space="preserve">How the solution will work</w:t>
+        <w:t xml:space="preserve">Recorded room and design details</w:t>
       </w:r>
     </w:p>
     <w:p>
@@ -183,7 +198,1074 @@
           <w:sz w:val="22"/>
           <w:szCs w:val="22"/>
         </w:rPr>
-        <w:t xml:space="preserve">The proposed AV-over-IP system distributes content between the scheduled endpoints over a suitably designed network. This allows the agreed destinations to share sources, with any future expansion subject to endpoint compatibility, switch capacity and licensing requirements.</w:t>
+        <w:t xml:space="preserve">Room dimensions, capacity and site conditions require confirmation.</w:t>
+      </w:r>
+    </w:p>
+    <w:p>
+      <w:pPr>
+        <w:pStyle w:val="Heading2"/>
+        <w:keepNext/>
+        <w:spacing w:after="120" w:before="240"/>
+      </w:pPr>
+      <w:r>
+        <w:rPr>
+          <w:rFonts w:ascii="Calibri" w:cs="Calibri" w:eastAsia="Calibri" w:hAnsi="Calibri"/>
+          <w:b/>
+          <w:bCs/>
+          <w:color w:val="08223A"/>
+          <w:sz w:val="26"/>
+          <w:szCs w:val="26"/>
+        </w:rPr>
+        <w:t xml:space="preserve">What this space delivers</w:t>
+      </w:r>
+    </w:p>
+    <w:p>
+      <w:pPr>
+        <w:pStyle w:val="ListParagraph"/>
+        <w:numPr>
+          <w:ilvl w:val="0"/>
+          <w:numId w:val="2"/>
+        </w:numPr>
+        <w:spacing w:after="80" w:line="290"/>
+      </w:pPr>
+      <w:r>
+        <w:rPr>
+          <w:rFonts w:ascii="Calibri" w:cs="Calibri" w:eastAsia="Calibri" w:hAnsi="Calibri"/>
+          <w:color w:val="172B3A"/>
+          <w:sz w:val="22"/>
+          <w:szCs w:val="22"/>
+        </w:rPr>
+        <w:t xml:space="preserve">Operational continuity: Operators retain controlled access to approved sources.</w:t>
+      </w:r>
+    </w:p>
+    <w:p>
+      <w:pPr>
+        <w:pStyle w:val="Heading2"/>
+        <w:keepNext/>
+        <w:spacing w:after="120" w:before="240"/>
+      </w:pPr>
+      <w:r>
+        <w:rPr>
+          <w:rFonts w:ascii="Calibri" w:cs="Calibri" w:eastAsia="Calibri" w:hAnsi="Calibri"/>
+          <w:b/>
+          <w:bCs/>
+          <w:color w:val="08223A"/>
+          <w:sz w:val="26"/>
+          <w:szCs w:val="26"/>
+        </w:rPr>
+        <w:t xml:space="preserve">In this room</w:t>
+      </w:r>
+    </w:p>
+    <w:p>
+      <w:pPr>
+        <w:spacing w:after="160" w:line="320"/>
+      </w:pPr>
+      <w:r>
+        <w:rPr>
+          <w:rFonts w:ascii="Calibri" w:cs="Calibri" w:eastAsia="Calibri" w:hAnsi="Calibri"/>
+          <w:color w:val="172B3A"/>
+          <w:sz w:val="22"/>
+          <w:szCs w:val="22"/>
+        </w:rPr>
+        <w:t xml:space="preserve">Grouped by the recorded equipment role. Item references match the equipment schedule; optional items remain subject to selection. Third-party equipment and services are detailed in Complete System Design and Responsibilities.</w:t>
+      </w:r>
+    </w:p>
+    <w:p>
+      <w:pPr>
+        <w:pStyle w:val="Heading2"/>
+        <w:keepNext/>
+        <w:spacing w:after="120" w:before="240"/>
+      </w:pPr>
+      <w:r>
+        <w:rPr>
+          <w:rFonts w:ascii="Calibri" w:cs="Calibri" w:eastAsia="Calibri" w:hAnsi="Calibri"/>
+          <w:b/>
+          <w:bCs/>
+          <w:color w:val="08223A"/>
+          <w:sz w:val="26"/>
+          <w:szCs w:val="26"/>
+        </w:rPr>
+        <w:t xml:space="preserve">Encode operator sources</w:t>
+      </w:r>
+    </w:p>
+    <w:tbl>
+      <w:tblPr>
+        <w:tblW w:type="dxa" w:w="9360"/>
+        <w:tblBorders>
+          <w:top w:val="single" w:color="CBD5E1" w:sz="4"/>
+          <w:left w:val="single" w:color="CBD5E1" w:sz="4"/>
+          <w:bottom w:val="single" w:color="CBD5E1" w:sz="4"/>
+          <w:right w:val="single" w:color="CBD5E1" w:sz="4"/>
+          <w:insideH w:val="single" w:color="CBD5E1" w:sz="3"/>
+          <w:insideV w:val="single" w:color="CBD5E1" w:sz="3"/>
+        </w:tblBorders>
+        <w:tblLayout w:type="fixed"/>
+      </w:tblPr>
+      <w:tblGrid>
+        <w:gridCol w:w="600"/>
+        <w:gridCol w:w="1800"/>
+        <w:gridCol w:w="4260"/>
+        <w:gridCol w:w="600"/>
+        <w:gridCol w:w="2100"/>
+      </w:tblGrid>
+      <w:tr>
+        <w:trPr>
+          <w:tblHeader/>
+        </w:trPr>
+        <w:tc>
+          <w:tcPr>
+            <w:tcW w:type="dxa" w:w="600"/>
+            <w:shd w:fill="F4F6F9" w:val="clear"/>
+            <w:tcMar>
+              <w:top w:type="dxa" w:w="80"/>
+              <w:left w:type="dxa" w:w="120"/>
+              <w:bottom w:type="dxa" w:w="80"/>
+              <w:right w:type="dxa" w:w="120"/>
+            </w:tcMar>
+          </w:tcPr>
+          <w:p>
+            <w:pPr>
+              <w:spacing w:after="0" w:line="260"/>
+            </w:pPr>
+            <w:r>
+              <w:rPr>
+                <w:rFonts w:ascii="Calibri" w:cs="Calibri" w:eastAsia="Calibri" w:hAnsi="Calibri"/>
+                <w:b/>
+                <w:bCs/>
+                <w:color w:val="08223A"/>
+                <w:sz w:val="18"/>
+                <w:szCs w:val="18"/>
+              </w:rPr>
+              <w:t xml:space="preserve">Item</w:t>
+            </w:r>
+          </w:p>
+        </w:tc>
+        <w:tc>
+          <w:tcPr>
+            <w:tcW w:type="dxa" w:w="1800"/>
+            <w:shd w:fill="F4F6F9" w:val="clear"/>
+            <w:tcMar>
+              <w:top w:type="dxa" w:w="80"/>
+              <w:left w:type="dxa" w:w="120"/>
+              <w:bottom w:type="dxa" w:w="80"/>
+              <w:right w:type="dxa" w:w="120"/>
+            </w:tcMar>
+          </w:tcPr>
+          <w:p>
+            <w:pPr>
+              <w:spacing w:after="0" w:line="260"/>
+            </w:pPr>
+            <w:r>
+              <w:rPr>
+                <w:rFonts w:ascii="Calibri" w:cs="Calibri" w:eastAsia="Calibri" w:hAnsi="Calibri"/>
+                <w:b/>
+                <w:bCs/>
+                <w:color w:val="08223A"/>
+                <w:sz w:val="18"/>
+                <w:szCs w:val="18"/>
+              </w:rPr>
+              <w:t xml:space="preserve">Model</w:t>
+            </w:r>
+          </w:p>
+        </w:tc>
+        <w:tc>
+          <w:tcPr>
+            <w:tcW w:type="dxa" w:w="4260"/>
+            <w:shd w:fill="F4F6F9" w:val="clear"/>
+            <w:tcMar>
+              <w:top w:type="dxa" w:w="80"/>
+              <w:left w:type="dxa" w:w="120"/>
+              <w:bottom w:type="dxa" w:w="80"/>
+              <w:right w:type="dxa" w:w="120"/>
+            </w:tcMar>
+          </w:tcPr>
+          <w:p>
+            <w:pPr>
+              <w:spacing w:after="0" w:line="260"/>
+            </w:pPr>
+            <w:r>
+              <w:rPr>
+                <w:rFonts w:ascii="Calibri" w:cs="Calibri" w:eastAsia="Calibri" w:hAnsi="Calibri"/>
+                <w:b/>
+                <w:bCs/>
+                <w:color w:val="08223A"/>
+                <w:sz w:val="18"/>
+                <w:szCs w:val="18"/>
+              </w:rPr>
+              <w:t xml:space="preserve">Description</w:t>
+            </w:r>
+          </w:p>
+        </w:tc>
+        <w:tc>
+          <w:tcPr>
+            <w:tcW w:type="dxa" w:w="600"/>
+            <w:shd w:fill="F4F6F9" w:val="clear"/>
+            <w:tcMar>
+              <w:top w:type="dxa" w:w="80"/>
+              <w:left w:type="dxa" w:w="120"/>
+              <w:bottom w:type="dxa" w:w="80"/>
+              <w:right w:type="dxa" w:w="120"/>
+            </w:tcMar>
+          </w:tcPr>
+          <w:p>
+            <w:pPr>
+              <w:spacing w:after="0" w:line="260"/>
+            </w:pPr>
+            <w:r>
+              <w:rPr>
+                <w:rFonts w:ascii="Calibri" w:cs="Calibri" w:eastAsia="Calibri" w:hAnsi="Calibri"/>
+                <w:b/>
+                <w:bCs/>
+                <w:color w:val="08223A"/>
+                <w:sz w:val="18"/>
+                <w:szCs w:val="18"/>
+              </w:rPr>
+              <w:t xml:space="preserve">Qty</w:t>
+            </w:r>
+          </w:p>
+        </w:tc>
+        <w:tc>
+          <w:tcPr>
+            <w:tcW w:type="dxa" w:w="2100"/>
+            <w:shd w:fill="F4F6F9" w:val="clear"/>
+            <w:tcMar>
+              <w:top w:type="dxa" w:w="80"/>
+              <w:left w:type="dxa" w:w="120"/>
+              <w:bottom w:type="dxa" w:w="80"/>
+              <w:right w:type="dxa" w:w="120"/>
+            </w:tcMar>
+          </w:tcPr>
+          <w:p>
+            <w:pPr>
+              <w:spacing w:after="0" w:line="260"/>
+            </w:pPr>
+            <w:r>
+              <w:rPr>
+                <w:rFonts w:ascii="Calibri" w:cs="Calibri" w:eastAsia="Calibri" w:hAnsi="Calibri"/>
+                <w:b/>
+                <w:bCs/>
+                <w:color w:val="08223A"/>
+                <w:sz w:val="18"/>
+                <w:szCs w:val="18"/>
+              </w:rPr>
+              <w:t xml:space="preserve">Selection</w:t>
+            </w:r>
+          </w:p>
+        </w:tc>
+      </w:tr>
+      <w:tr>
+        <w:tc>
+          <w:tcPr>
+            <w:tcW w:type="dxa" w:w="600"/>
+            <w:tcMar>
+              <w:top w:type="dxa" w:w="80"/>
+              <w:left w:type="dxa" w:w="120"/>
+              <w:bottom w:type="dxa" w:w="80"/>
+              <w:right w:type="dxa" w:w="120"/>
+            </w:tcMar>
+          </w:tcPr>
+          <w:p>
+            <w:pPr>
+              <w:spacing w:after="0" w:line="260"/>
+            </w:pPr>
+            <w:r>
+              <w:rPr>
+                <w:rFonts w:ascii="Calibri" w:cs="Calibri" w:eastAsia="Calibri" w:hAnsi="Calibri"/>
+                <w:color w:val="172B3A"/>
+                <w:sz w:val="18"/>
+                <w:szCs w:val="18"/>
+              </w:rPr>
+              <w:t xml:space="preserve">1</w:t>
+            </w:r>
+          </w:p>
+        </w:tc>
+        <w:tc>
+          <w:tcPr>
+            <w:tcW w:type="dxa" w:w="1800"/>
+            <w:tcMar>
+              <w:top w:type="dxa" w:w="80"/>
+              <w:left w:type="dxa" w:w="120"/>
+              <w:bottom w:type="dxa" w:w="80"/>
+              <w:right w:type="dxa" w:w="120"/>
+            </w:tcMar>
+          </w:tcPr>
+          <w:p>
+            <w:pPr>
+              <w:spacing w:after="0" w:line="260"/>
+            </w:pPr>
+            <w:r>
+              <w:rPr>
+                <w:rFonts w:ascii="Calibri" w:cs="Calibri" w:eastAsia="Calibri" w:hAnsi="Calibri"/>
+                <w:color w:val="172B3A"/>
+                <w:sz w:val="18"/>
+                <w:szCs w:val="18"/>
+              </w:rPr>
+              <w:t xml:space="preserve">NHD-600-TX</w:t>
+            </w:r>
+          </w:p>
+        </w:tc>
+        <w:tc>
+          <w:tcPr>
+            <w:tcW w:type="dxa" w:w="4260"/>
+            <w:tcMar>
+              <w:top w:type="dxa" w:w="80"/>
+              <w:left w:type="dxa" w:w="120"/>
+              <w:bottom w:type="dxa" w:w="80"/>
+              <w:right w:type="dxa" w:w="120"/>
+            </w:tcMar>
+          </w:tcPr>
+          <w:p>
+            <w:pPr>
+              <w:spacing w:after="0" w:line="260"/>
+            </w:pPr>
+            <w:r>
+              <w:rPr>
+                <w:rFonts w:ascii="Calibri" w:cs="Calibri" w:eastAsia="Calibri" w:hAnsi="Calibri"/>
+                <w:color w:val="172B3A"/>
+                <w:sz w:val="18"/>
+                <w:szCs w:val="18"/>
+              </w:rPr>
+              <w:t xml:space="preserve">NetworkHD 600 encoder</w:t>
+            </w:r>
+          </w:p>
+        </w:tc>
+        <w:tc>
+          <w:tcPr>
+            <w:tcW w:type="dxa" w:w="600"/>
+            <w:tcMar>
+              <w:top w:type="dxa" w:w="80"/>
+              <w:left w:type="dxa" w:w="120"/>
+              <w:bottom w:type="dxa" w:w="80"/>
+              <w:right w:type="dxa" w:w="120"/>
+            </w:tcMar>
+          </w:tcPr>
+          <w:p>
+            <w:pPr>
+              <w:spacing w:after="0" w:line="260"/>
+            </w:pPr>
+            <w:r>
+              <w:rPr>
+                <w:rFonts w:ascii="Calibri" w:cs="Calibri" w:eastAsia="Calibri" w:hAnsi="Calibri"/>
+                <w:color w:val="172B3A"/>
+                <w:sz w:val="18"/>
+                <w:szCs w:val="18"/>
+              </w:rPr>
+              <w:t xml:space="preserve">2</w:t>
+            </w:r>
+          </w:p>
+        </w:tc>
+        <w:tc>
+          <w:tcPr>
+            <w:tcW w:type="dxa" w:w="2100"/>
+            <w:tcMar>
+              <w:top w:type="dxa" w:w="80"/>
+              <w:left w:type="dxa" w:w="120"/>
+              <w:bottom w:type="dxa" w:w="80"/>
+              <w:right w:type="dxa" w:w="120"/>
+            </w:tcMar>
+          </w:tcPr>
+          <w:p>
+            <w:pPr>
+              <w:spacing w:after="0" w:line="260"/>
+            </w:pPr>
+            <w:r>
+              <w:rPr>
+                <w:rFonts w:ascii="Calibri" w:cs="Calibri" w:eastAsia="Calibri" w:hAnsi="Calibri"/>
+                <w:color w:val="172B3A"/>
+                <w:sz w:val="18"/>
+                <w:szCs w:val="18"/>
+              </w:rPr>
+              <w:t xml:space="preserve">Required</w:t>
+            </w:r>
+          </w:p>
+        </w:tc>
+      </w:tr>
+    </w:tbl>
+    <w:p>
+      <w:pPr>
+        <w:pStyle w:val="Heading2"/>
+        <w:keepNext/>
+        <w:spacing w:after="120" w:before="240"/>
+      </w:pPr>
+      <w:r>
+        <w:rPr>
+          <w:rFonts w:ascii="Calibri" w:cs="Calibri" w:eastAsia="Calibri" w:hAnsi="Calibri"/>
+          <w:b/>
+          <w:bCs/>
+          <w:color w:val="08223A"/>
+          <w:sz w:val="26"/>
+          <w:szCs w:val="26"/>
+        </w:rPr>
+        <w:t xml:space="preserve">Decode display feeds</w:t>
+      </w:r>
+    </w:p>
+    <w:tbl>
+      <w:tblPr>
+        <w:tblW w:type="dxa" w:w="9360"/>
+        <w:tblBorders>
+          <w:top w:val="single" w:color="CBD5E1" w:sz="4"/>
+          <w:left w:val="single" w:color="CBD5E1" w:sz="4"/>
+          <w:bottom w:val="single" w:color="CBD5E1" w:sz="4"/>
+          <w:right w:val="single" w:color="CBD5E1" w:sz="4"/>
+          <w:insideH w:val="single" w:color="CBD5E1" w:sz="3"/>
+          <w:insideV w:val="single" w:color="CBD5E1" w:sz="3"/>
+        </w:tblBorders>
+        <w:tblLayout w:type="fixed"/>
+      </w:tblPr>
+      <w:tblGrid>
+        <w:gridCol w:w="600"/>
+        <w:gridCol w:w="1800"/>
+        <w:gridCol w:w="4260"/>
+        <w:gridCol w:w="600"/>
+        <w:gridCol w:w="2100"/>
+      </w:tblGrid>
+      <w:tr>
+        <w:trPr>
+          <w:tblHeader/>
+        </w:trPr>
+        <w:tc>
+          <w:tcPr>
+            <w:tcW w:type="dxa" w:w="600"/>
+            <w:shd w:fill="F4F6F9" w:val="clear"/>
+            <w:tcMar>
+              <w:top w:type="dxa" w:w="80"/>
+              <w:left w:type="dxa" w:w="120"/>
+              <w:bottom w:type="dxa" w:w="80"/>
+              <w:right w:type="dxa" w:w="120"/>
+            </w:tcMar>
+          </w:tcPr>
+          <w:p>
+            <w:pPr>
+              <w:spacing w:after="0" w:line="260"/>
+            </w:pPr>
+            <w:r>
+              <w:rPr>
+                <w:rFonts w:ascii="Calibri" w:cs="Calibri" w:eastAsia="Calibri" w:hAnsi="Calibri"/>
+                <w:b/>
+                <w:bCs/>
+                <w:color w:val="08223A"/>
+                <w:sz w:val="18"/>
+                <w:szCs w:val="18"/>
+              </w:rPr>
+              <w:t xml:space="preserve">Item</w:t>
+            </w:r>
+          </w:p>
+        </w:tc>
+        <w:tc>
+          <w:tcPr>
+            <w:tcW w:type="dxa" w:w="1800"/>
+            <w:shd w:fill="F4F6F9" w:val="clear"/>
+            <w:tcMar>
+              <w:top w:type="dxa" w:w="80"/>
+              <w:left w:type="dxa" w:w="120"/>
+              <w:bottom w:type="dxa" w:w="80"/>
+              <w:right w:type="dxa" w:w="120"/>
+            </w:tcMar>
+          </w:tcPr>
+          <w:p>
+            <w:pPr>
+              <w:spacing w:after="0" w:line="260"/>
+            </w:pPr>
+            <w:r>
+              <w:rPr>
+                <w:rFonts w:ascii="Calibri" w:cs="Calibri" w:eastAsia="Calibri" w:hAnsi="Calibri"/>
+                <w:b/>
+                <w:bCs/>
+                <w:color w:val="08223A"/>
+                <w:sz w:val="18"/>
+                <w:szCs w:val="18"/>
+              </w:rPr>
+              <w:t xml:space="preserve">Model</w:t>
+            </w:r>
+          </w:p>
+        </w:tc>
+        <w:tc>
+          <w:tcPr>
+            <w:tcW w:type="dxa" w:w="4260"/>
+            <w:shd w:fill="F4F6F9" w:val="clear"/>
+            <w:tcMar>
+              <w:top w:type="dxa" w:w="80"/>
+              <w:left w:type="dxa" w:w="120"/>
+              <w:bottom w:type="dxa" w:w="80"/>
+              <w:right w:type="dxa" w:w="120"/>
+            </w:tcMar>
+          </w:tcPr>
+          <w:p>
+            <w:pPr>
+              <w:spacing w:after="0" w:line="260"/>
+            </w:pPr>
+            <w:r>
+              <w:rPr>
+                <w:rFonts w:ascii="Calibri" w:cs="Calibri" w:eastAsia="Calibri" w:hAnsi="Calibri"/>
+                <w:b/>
+                <w:bCs/>
+                <w:color w:val="08223A"/>
+                <w:sz w:val="18"/>
+                <w:szCs w:val="18"/>
+              </w:rPr>
+              <w:t xml:space="preserve">Description</w:t>
+            </w:r>
+          </w:p>
+        </w:tc>
+        <w:tc>
+          <w:tcPr>
+            <w:tcW w:type="dxa" w:w="600"/>
+            <w:shd w:fill="F4F6F9" w:val="clear"/>
+            <w:tcMar>
+              <w:top w:type="dxa" w:w="80"/>
+              <w:left w:type="dxa" w:w="120"/>
+              <w:bottom w:type="dxa" w:w="80"/>
+              <w:right w:type="dxa" w:w="120"/>
+            </w:tcMar>
+          </w:tcPr>
+          <w:p>
+            <w:pPr>
+              <w:spacing w:after="0" w:line="260"/>
+            </w:pPr>
+            <w:r>
+              <w:rPr>
+                <w:rFonts w:ascii="Calibri" w:cs="Calibri" w:eastAsia="Calibri" w:hAnsi="Calibri"/>
+                <w:b/>
+                <w:bCs/>
+                <w:color w:val="08223A"/>
+                <w:sz w:val="18"/>
+                <w:szCs w:val="18"/>
+              </w:rPr>
+              <w:t xml:space="preserve">Qty</w:t>
+            </w:r>
+          </w:p>
+        </w:tc>
+        <w:tc>
+          <w:tcPr>
+            <w:tcW w:type="dxa" w:w="2100"/>
+            <w:shd w:fill="F4F6F9" w:val="clear"/>
+            <w:tcMar>
+              <w:top w:type="dxa" w:w="80"/>
+              <w:left w:type="dxa" w:w="120"/>
+              <w:bottom w:type="dxa" w:w="80"/>
+              <w:right w:type="dxa" w:w="120"/>
+            </w:tcMar>
+          </w:tcPr>
+          <w:p>
+            <w:pPr>
+              <w:spacing w:after="0" w:line="260"/>
+            </w:pPr>
+            <w:r>
+              <w:rPr>
+                <w:rFonts w:ascii="Calibri" w:cs="Calibri" w:eastAsia="Calibri" w:hAnsi="Calibri"/>
+                <w:b/>
+                <w:bCs/>
+                <w:color w:val="08223A"/>
+                <w:sz w:val="18"/>
+                <w:szCs w:val="18"/>
+              </w:rPr>
+              <w:t xml:space="preserve">Selection</w:t>
+            </w:r>
+          </w:p>
+        </w:tc>
+      </w:tr>
+      <w:tr>
+        <w:tc>
+          <w:tcPr>
+            <w:tcW w:type="dxa" w:w="600"/>
+            <w:tcMar>
+              <w:top w:type="dxa" w:w="80"/>
+              <w:left w:type="dxa" w:w="120"/>
+              <w:bottom w:type="dxa" w:w="80"/>
+              <w:right w:type="dxa" w:w="120"/>
+            </w:tcMar>
+          </w:tcPr>
+          <w:p>
+            <w:pPr>
+              <w:spacing w:after="0" w:line="260"/>
+            </w:pPr>
+            <w:r>
+              <w:rPr>
+                <w:rFonts w:ascii="Calibri" w:cs="Calibri" w:eastAsia="Calibri" w:hAnsi="Calibri"/>
+                <w:color w:val="172B3A"/>
+                <w:sz w:val="18"/>
+                <w:szCs w:val="18"/>
+              </w:rPr>
+              <w:t xml:space="preserve">2</w:t>
+            </w:r>
+          </w:p>
+        </w:tc>
+        <w:tc>
+          <w:tcPr>
+            <w:tcW w:type="dxa" w:w="1800"/>
+            <w:tcMar>
+              <w:top w:type="dxa" w:w="80"/>
+              <w:left w:type="dxa" w:w="120"/>
+              <w:bottom w:type="dxa" w:w="80"/>
+              <w:right w:type="dxa" w:w="120"/>
+            </w:tcMar>
+          </w:tcPr>
+          <w:p>
+            <w:pPr>
+              <w:spacing w:after="0" w:line="260"/>
+            </w:pPr>
+            <w:r>
+              <w:rPr>
+                <w:rFonts w:ascii="Calibri" w:cs="Calibri" w:eastAsia="Calibri" w:hAnsi="Calibri"/>
+                <w:color w:val="172B3A"/>
+                <w:sz w:val="18"/>
+                <w:szCs w:val="18"/>
+              </w:rPr>
+              <w:t xml:space="preserve">NHD-600-RX</w:t>
+            </w:r>
+          </w:p>
+        </w:tc>
+        <w:tc>
+          <w:tcPr>
+            <w:tcW w:type="dxa" w:w="4260"/>
+            <w:tcMar>
+              <w:top w:type="dxa" w:w="80"/>
+              <w:left w:type="dxa" w:w="120"/>
+              <w:bottom w:type="dxa" w:w="80"/>
+              <w:right w:type="dxa" w:w="120"/>
+            </w:tcMar>
+          </w:tcPr>
+          <w:p>
+            <w:pPr>
+              <w:spacing w:after="0" w:line="260"/>
+            </w:pPr>
+            <w:r>
+              <w:rPr>
+                <w:rFonts w:ascii="Calibri" w:cs="Calibri" w:eastAsia="Calibri" w:hAnsi="Calibri"/>
+                <w:color w:val="172B3A"/>
+                <w:sz w:val="18"/>
+                <w:szCs w:val="18"/>
+              </w:rPr>
+              <w:t xml:space="preserve">NetworkHD 600 decoder</w:t>
+            </w:r>
+          </w:p>
+        </w:tc>
+        <w:tc>
+          <w:tcPr>
+            <w:tcW w:type="dxa" w:w="600"/>
+            <w:tcMar>
+              <w:top w:type="dxa" w:w="80"/>
+              <w:left w:type="dxa" w:w="120"/>
+              <w:bottom w:type="dxa" w:w="80"/>
+              <w:right w:type="dxa" w:w="120"/>
+            </w:tcMar>
+          </w:tcPr>
+          <w:p>
+            <w:pPr>
+              <w:spacing w:after="0" w:line="260"/>
+            </w:pPr>
+            <w:r>
+              <w:rPr>
+                <w:rFonts w:ascii="Calibri" w:cs="Calibri" w:eastAsia="Calibri" w:hAnsi="Calibri"/>
+                <w:color w:val="172B3A"/>
+                <w:sz w:val="18"/>
+                <w:szCs w:val="18"/>
+              </w:rPr>
+              <w:t xml:space="preserve">4</w:t>
+            </w:r>
+          </w:p>
+        </w:tc>
+        <w:tc>
+          <w:tcPr>
+            <w:tcW w:type="dxa" w:w="2100"/>
+            <w:tcMar>
+              <w:top w:type="dxa" w:w="80"/>
+              <w:left w:type="dxa" w:w="120"/>
+              <w:bottom w:type="dxa" w:w="80"/>
+              <w:right w:type="dxa" w:w="120"/>
+            </w:tcMar>
+          </w:tcPr>
+          <w:p>
+            <w:pPr>
+              <w:spacing w:after="0" w:line="260"/>
+            </w:pPr>
+            <w:r>
+              <w:rPr>
+                <w:rFonts w:ascii="Calibri" w:cs="Calibri" w:eastAsia="Calibri" w:hAnsi="Calibri"/>
+                <w:color w:val="172B3A"/>
+                <w:sz w:val="18"/>
+                <w:szCs w:val="18"/>
+              </w:rPr>
+              <w:t xml:space="preserve">Required</w:t>
+            </w:r>
+          </w:p>
+        </w:tc>
+      </w:tr>
+    </w:tbl>
+    <w:p>
+      <w:pPr>
+        <w:pStyle w:val="Heading2"/>
+        <w:keepNext/>
+        <w:spacing w:after="120" w:before="240"/>
+      </w:pPr>
+      <w:r>
+        <w:rPr>
+          <w:rFonts w:ascii="Calibri" w:cs="Calibri" w:eastAsia="Calibri" w:hAnsi="Calibri"/>
+          <w:b/>
+          <w:bCs/>
+          <w:color w:val="08223A"/>
+          <w:sz w:val="26"/>
+          <w:szCs w:val="26"/>
+        </w:rPr>
+        <w:t xml:space="preserve">Routing control</w:t>
+      </w:r>
+    </w:p>
+    <w:tbl>
+      <w:tblPr>
+        <w:tblW w:type="dxa" w:w="9360"/>
+        <w:tblBorders>
+          <w:top w:val="single" w:color="CBD5E1" w:sz="4"/>
+          <w:left w:val="single" w:color="CBD5E1" w:sz="4"/>
+          <w:bottom w:val="single" w:color="CBD5E1" w:sz="4"/>
+          <w:right w:val="single" w:color="CBD5E1" w:sz="4"/>
+          <w:insideH w:val="single" w:color="CBD5E1" w:sz="3"/>
+          <w:insideV w:val="single" w:color="CBD5E1" w:sz="3"/>
+        </w:tblBorders>
+        <w:tblLayout w:type="fixed"/>
+      </w:tblPr>
+      <w:tblGrid>
+        <w:gridCol w:w="600"/>
+        <w:gridCol w:w="1800"/>
+        <w:gridCol w:w="4260"/>
+        <w:gridCol w:w="600"/>
+        <w:gridCol w:w="2100"/>
+      </w:tblGrid>
+      <w:tr>
+        <w:trPr>
+          <w:tblHeader/>
+        </w:trPr>
+        <w:tc>
+          <w:tcPr>
+            <w:tcW w:type="dxa" w:w="600"/>
+            <w:shd w:fill="F4F6F9" w:val="clear"/>
+            <w:tcMar>
+              <w:top w:type="dxa" w:w="80"/>
+              <w:left w:type="dxa" w:w="120"/>
+              <w:bottom w:type="dxa" w:w="80"/>
+              <w:right w:type="dxa" w:w="120"/>
+            </w:tcMar>
+          </w:tcPr>
+          <w:p>
+            <w:pPr>
+              <w:spacing w:after="0" w:line="260"/>
+            </w:pPr>
+            <w:r>
+              <w:rPr>
+                <w:rFonts w:ascii="Calibri" w:cs="Calibri" w:eastAsia="Calibri" w:hAnsi="Calibri"/>
+                <w:b/>
+                <w:bCs/>
+                <w:color w:val="08223A"/>
+                <w:sz w:val="18"/>
+                <w:szCs w:val="18"/>
+              </w:rPr>
+              <w:t xml:space="preserve">Item</w:t>
+            </w:r>
+          </w:p>
+        </w:tc>
+        <w:tc>
+          <w:tcPr>
+            <w:tcW w:type="dxa" w:w="1800"/>
+            <w:shd w:fill="F4F6F9" w:val="clear"/>
+            <w:tcMar>
+              <w:top w:type="dxa" w:w="80"/>
+              <w:left w:type="dxa" w:w="120"/>
+              <w:bottom w:type="dxa" w:w="80"/>
+              <w:right w:type="dxa" w:w="120"/>
+            </w:tcMar>
+          </w:tcPr>
+          <w:p>
+            <w:pPr>
+              <w:spacing w:after="0" w:line="260"/>
+            </w:pPr>
+            <w:r>
+              <w:rPr>
+                <w:rFonts w:ascii="Calibri" w:cs="Calibri" w:eastAsia="Calibri" w:hAnsi="Calibri"/>
+                <w:b/>
+                <w:bCs/>
+                <w:color w:val="08223A"/>
+                <w:sz w:val="18"/>
+                <w:szCs w:val="18"/>
+              </w:rPr>
+              <w:t xml:space="preserve">Model</w:t>
+            </w:r>
+          </w:p>
+        </w:tc>
+        <w:tc>
+          <w:tcPr>
+            <w:tcW w:type="dxa" w:w="4260"/>
+            <w:shd w:fill="F4F6F9" w:val="clear"/>
+            <w:tcMar>
+              <w:top w:type="dxa" w:w="80"/>
+              <w:left w:type="dxa" w:w="120"/>
+              <w:bottom w:type="dxa" w:w="80"/>
+              <w:right w:type="dxa" w:w="120"/>
+            </w:tcMar>
+          </w:tcPr>
+          <w:p>
+            <w:pPr>
+              <w:spacing w:after="0" w:line="260"/>
+            </w:pPr>
+            <w:r>
+              <w:rPr>
+                <w:rFonts w:ascii="Calibri" w:cs="Calibri" w:eastAsia="Calibri" w:hAnsi="Calibri"/>
+                <w:b/>
+                <w:bCs/>
+                <w:color w:val="08223A"/>
+                <w:sz w:val="18"/>
+                <w:szCs w:val="18"/>
+              </w:rPr>
+              <w:t xml:space="preserve">Description</w:t>
+            </w:r>
+          </w:p>
+        </w:tc>
+        <w:tc>
+          <w:tcPr>
+            <w:tcW w:type="dxa" w:w="600"/>
+            <w:shd w:fill="F4F6F9" w:val="clear"/>
+            <w:tcMar>
+              <w:top w:type="dxa" w:w="80"/>
+              <w:left w:type="dxa" w:w="120"/>
+              <w:bottom w:type="dxa" w:w="80"/>
+              <w:right w:type="dxa" w:w="120"/>
+            </w:tcMar>
+          </w:tcPr>
+          <w:p>
+            <w:pPr>
+              <w:spacing w:after="0" w:line="260"/>
+            </w:pPr>
+            <w:r>
+              <w:rPr>
+                <w:rFonts w:ascii="Calibri" w:cs="Calibri" w:eastAsia="Calibri" w:hAnsi="Calibri"/>
+                <w:b/>
+                <w:bCs/>
+                <w:color w:val="08223A"/>
+                <w:sz w:val="18"/>
+                <w:szCs w:val="18"/>
+              </w:rPr>
+              <w:t xml:space="preserve">Qty</w:t>
+            </w:r>
+          </w:p>
+        </w:tc>
+        <w:tc>
+          <w:tcPr>
+            <w:tcW w:type="dxa" w:w="2100"/>
+            <w:shd w:fill="F4F6F9" w:val="clear"/>
+            <w:tcMar>
+              <w:top w:type="dxa" w:w="80"/>
+              <w:left w:type="dxa" w:w="120"/>
+              <w:bottom w:type="dxa" w:w="80"/>
+              <w:right w:type="dxa" w:w="120"/>
+            </w:tcMar>
+          </w:tcPr>
+          <w:p>
+            <w:pPr>
+              <w:spacing w:after="0" w:line="260"/>
+            </w:pPr>
+            <w:r>
+              <w:rPr>
+                <w:rFonts w:ascii="Calibri" w:cs="Calibri" w:eastAsia="Calibri" w:hAnsi="Calibri"/>
+                <w:b/>
+                <w:bCs/>
+                <w:color w:val="08223A"/>
+                <w:sz w:val="18"/>
+                <w:szCs w:val="18"/>
+              </w:rPr>
+              <w:t xml:space="preserve">Selection</w:t>
+            </w:r>
+          </w:p>
+        </w:tc>
+      </w:tr>
+      <w:tr>
+        <w:tc>
+          <w:tcPr>
+            <w:tcW w:type="dxa" w:w="600"/>
+            <w:tcMar>
+              <w:top w:type="dxa" w:w="80"/>
+              <w:left w:type="dxa" w:w="120"/>
+              <w:bottom w:type="dxa" w:w="80"/>
+              <w:right w:type="dxa" w:w="120"/>
+            </w:tcMar>
+          </w:tcPr>
+          <w:p>
+            <w:pPr>
+              <w:spacing w:after="0" w:line="260"/>
+            </w:pPr>
+            <w:r>
+              <w:rPr>
+                <w:rFonts w:ascii="Calibri" w:cs="Calibri" w:eastAsia="Calibri" w:hAnsi="Calibri"/>
+                <w:color w:val="172B3A"/>
+                <w:sz w:val="18"/>
+                <w:szCs w:val="18"/>
+              </w:rPr>
+              <w:t xml:space="preserve">3</w:t>
+            </w:r>
+          </w:p>
+        </w:tc>
+        <w:tc>
+          <w:tcPr>
+            <w:tcW w:type="dxa" w:w="1800"/>
+            <w:tcMar>
+              <w:top w:type="dxa" w:w="80"/>
+              <w:left w:type="dxa" w:w="120"/>
+              <w:bottom w:type="dxa" w:w="80"/>
+              <w:right w:type="dxa" w:w="120"/>
+            </w:tcMar>
+          </w:tcPr>
+          <w:p>
+            <w:pPr>
+              <w:spacing w:after="0" w:line="260"/>
+            </w:pPr>
+            <w:r>
+              <w:rPr>
+                <w:rFonts w:ascii="Calibri" w:cs="Calibri" w:eastAsia="Calibri" w:hAnsi="Calibri"/>
+                <w:color w:val="172B3A"/>
+                <w:sz w:val="18"/>
+                <w:szCs w:val="18"/>
+              </w:rPr>
+              <w:t xml:space="preserve">NHD-CTL-PRO-V2</w:t>
+            </w:r>
+          </w:p>
+        </w:tc>
+        <w:tc>
+          <w:tcPr>
+            <w:tcW w:type="dxa" w:w="4260"/>
+            <w:tcMar>
+              <w:top w:type="dxa" w:w="80"/>
+              <w:left w:type="dxa" w:w="120"/>
+              <w:bottom w:type="dxa" w:w="80"/>
+              <w:right w:type="dxa" w:w="120"/>
+            </w:tcMar>
+          </w:tcPr>
+          <w:p>
+            <w:pPr>
+              <w:spacing w:after="0" w:line="260"/>
+            </w:pPr>
+            <w:r>
+              <w:rPr>
+                <w:rFonts w:ascii="Calibri" w:cs="Calibri" w:eastAsia="Calibri" w:hAnsi="Calibri"/>
+                <w:color w:val="172B3A"/>
+                <w:sz w:val="18"/>
+                <w:szCs w:val="18"/>
+              </w:rPr>
+              <w:t xml:space="preserve">NetworkHD controller</w:t>
+            </w:r>
+          </w:p>
+        </w:tc>
+        <w:tc>
+          <w:tcPr>
+            <w:tcW w:type="dxa" w:w="600"/>
+            <w:tcMar>
+              <w:top w:type="dxa" w:w="80"/>
+              <w:left w:type="dxa" w:w="120"/>
+              <w:bottom w:type="dxa" w:w="80"/>
+              <w:right w:type="dxa" w:w="120"/>
+            </w:tcMar>
+          </w:tcPr>
+          <w:p>
+            <w:pPr>
+              <w:spacing w:after="0" w:line="260"/>
+            </w:pPr>
+            <w:r>
+              <w:rPr>
+                <w:rFonts w:ascii="Calibri" w:cs="Calibri" w:eastAsia="Calibri" w:hAnsi="Calibri"/>
+                <w:color w:val="172B3A"/>
+                <w:sz w:val="18"/>
+                <w:szCs w:val="18"/>
+              </w:rPr>
+              <w:t xml:space="preserve">1</w:t>
+            </w:r>
+          </w:p>
+        </w:tc>
+        <w:tc>
+          <w:tcPr>
+            <w:tcW w:type="dxa" w:w="2100"/>
+            <w:tcMar>
+              <w:top w:type="dxa" w:w="80"/>
+              <w:left w:type="dxa" w:w="120"/>
+              <w:bottom w:type="dxa" w:w="80"/>
+              <w:right w:type="dxa" w:w="120"/>
+            </w:tcMar>
+          </w:tcPr>
+          <w:p>
+            <w:pPr>
+              <w:spacing w:after="0" w:line="260"/>
+            </w:pPr>
+            <w:r>
+              <w:rPr>
+                <w:rFonts w:ascii="Calibri" w:cs="Calibri" w:eastAsia="Calibri" w:hAnsi="Calibri"/>
+                <w:color w:val="172B3A"/>
+                <w:sz w:val="18"/>
+                <w:szCs w:val="18"/>
+              </w:rPr>
+              <w:t xml:space="preserve">Required</w:t>
+            </w:r>
+          </w:p>
+        </w:tc>
+      </w:tr>
+    </w:tbl>
+    <w:p>
+      <w:pPr>
+        <w:pStyle w:val="Heading1"/>
+        <w:keepNext/>
+        <w:spacing w:after="200" w:before="360"/>
+      </w:pPr>
+      <w:r>
+        <w:rPr>
+          <w:rFonts w:ascii="Calibri" w:cs="Calibri" w:eastAsia="Calibri" w:hAnsi="Calibri"/>
+          <w:b/>
+          <w:bCs/>
+          <w:color w:val="2E74B5"/>
+          <w:sz w:val="32"/>
+          <w:szCs w:val="32"/>
+        </w:rPr>
+        <w:t xml:space="preserve">Solution Overview</w:t>
+      </w:r>
+    </w:p>
+    <w:p>
+      <w:pPr>
+        <w:spacing w:after="160" w:line="320"/>
+        <w:jc w:val="both"/>
+      </w:pPr>
+      <w:r>
+        <w:rPr>
+          <w:rFonts w:ascii="Calibri" w:cs="Calibri" w:eastAsia="Calibri" w:hAnsi="Calibri"/>
+          <w:color w:val="172B3A"/>
+          <w:sz w:val="22"/>
+          <w:szCs w:val="22"/>
+        </w:rPr>
+        <w:t xml:space="preserve">NetworkHD 600 resilient AV-over-IP fabric</w:t>
+      </w:r>
+    </w:p>
+    <w:p>
+      <w:pPr>
+        <w:pStyle w:val="Heading2"/>
+        <w:keepNext/>
+        <w:spacing w:after="120" w:before="240"/>
+      </w:pPr>
+      <w:r>
+        <w:rPr>
+          <w:rFonts w:ascii="Calibri" w:cs="Calibri" w:eastAsia="Calibri" w:hAnsi="Calibri"/>
+          <w:b/>
+          <w:bCs/>
+          <w:color w:val="08223A"/>
+          <w:sz w:val="26"/>
+          <w:szCs w:val="26"/>
+        </w:rPr>
+        <w:t xml:space="preserve">How the solution will work</w:t>
+      </w:r>
+    </w:p>
+    <w:p>
+      <w:pPr>
+        <w:spacing w:after="160" w:line="320"/>
+      </w:pPr>
+      <w:r>
+        <w:rPr>
+          <w:rFonts w:ascii="Calibri" w:cs="Calibri" w:eastAsia="Calibri" w:hAnsi="Calibri"/>
+          <w:color w:val="172B3A"/>
+          <w:sz w:val="22"/>
+          <w:szCs w:val="22"/>
+        </w:rPr>
+        <w:t xml:space="preserve">1. Operators select an approved source and route it to any display.</w:t>
       </w:r>
     </w:p>
     <w:p>
@@ -2869,7 +3951,7 @@
                 <w:sz w:val="18"/>
                 <w:szCs w:val="18"/>
               </w:rPr>
-              <w:t xml:space="preserve">Confirm all non-WyreStorm equipment and delivery services.</w:t>
+              <w:t xml:space="preserve">Confirm all non-WyreStorm equipment and delivery services. — Scope status: validate</w:t>
             </w:r>
           </w:p>
         </w:tc>

</xml_diff>

<commit_message>
refactor(wingman): move compare scoring and wall draft rules into their own modules
The compare page entry and the wall builder mixed decision rules with React
state, so candidate scoring, the catalogue shortcuts, the wall draft status and
the autosave hook now live in modules with their own tests and the page entries
shrink under their recorded ceilings; the proposal output parity evidence is
regenerated from this verify pass so the shipped document matches the builder.

🤖 Generated with Codebuff
Co-Authored-By: Codebuff <noreply@codebuff.com>
</commit_message>
<xml_diff>
--- a/docs/release-evidence/proposal-output-parity/latest/proposal.docx
+++ b/docs/release-evidence/proposal-output-parity/latest/proposal.docx
@@ -408,7 +408,7 @@
                 <w:sz w:val="18"/>
                 <w:szCs w:val="18"/>
               </w:rPr>
-              <w:t xml:space="preserve">2026-10-23T05:24:16.620Z</w:t>
+              <w:t xml:space="preserve">2026-10-23T12:40:06.152Z</w:t>
             </w:r>
           </w:p>
         </w:tc>
@@ -842,7 +842,7 @@
                 <w:sz w:val="18"/>
                 <w:szCs w:val="18"/>
               </w:rPr>
-              <w:t xml:space="preserve">NHD-600-TX</w:t>
+              <w:t xml:space="preserve">NHD-600-E-TX</w:t>
             </w:r>
           </w:p>
         </w:tc>
@@ -868,7 +868,7 @@
                 <w:sz w:val="18"/>
                 <w:szCs w:val="18"/>
               </w:rPr>
-              <w:t xml:space="preserve">NetworkHD 600 encoder</w:t>
+              <w:t xml:space="preserve">NetworkHD 600 SDVoE encoder</w:t>
             </w:r>
           </w:p>
         </w:tc>
@@ -1167,7 +1167,7 @@
                 <w:sz w:val="18"/>
                 <w:szCs w:val="18"/>
               </w:rPr>
-              <w:t xml:space="preserve">NHD-600-RX</w:t>
+              <w:t xml:space="preserve">NHD-600-E-RX</w:t>
             </w:r>
           </w:p>
         </w:tc>
@@ -1193,7 +1193,7 @@
                 <w:sz w:val="18"/>
                 <w:szCs w:val="18"/>
               </w:rPr>
-              <w:t xml:space="preserve">NetworkHD 600 decoder</w:t>
+              <w:t xml:space="preserve">NetworkHD 600 SDVoE decoder</w:t>
             </w:r>
           </w:p>
         </w:tc>
@@ -3642,7 +3642,7 @@
                 <w:sz w:val="18"/>
                 <w:szCs w:val="18"/>
               </w:rPr>
-              <w:t xml:space="preserve">NHD-600-TX</w:t>
+              <w:t xml:space="preserve">NHD-600-E-TX</w:t>
             </w:r>
           </w:p>
         </w:tc>
@@ -3668,7 +3668,7 @@
                 <w:sz w:val="18"/>
                 <w:szCs w:val="18"/>
               </w:rPr>
-              <w:t xml:space="preserve">NetworkHD 600 encoder</w:t>
+              <w:t xml:space="preserve">NetworkHD 600 SDVoE encoder</w:t>
             </w:r>
           </w:p>
         </w:tc>
@@ -3806,7 +3806,7 @@
                 <w:sz w:val="18"/>
                 <w:szCs w:val="18"/>
               </w:rPr>
-              <w:t xml:space="preserve">NHD-600-RX</w:t>
+              <w:t xml:space="preserve">NHD-600-E-RX</w:t>
             </w:r>
           </w:p>
         </w:tc>
@@ -3832,7 +3832,7 @@
                 <w:sz w:val="18"/>
                 <w:szCs w:val="18"/>
               </w:rPr>
-              <w:t xml:space="preserve">NetworkHD 600 decoder</w:t>
+              <w:t xml:space="preserve">NetworkHD 600 SDVoE decoder</w:t>
             </w:r>
           </w:p>
         </w:tc>
@@ -5844,7 +5844,7 @@
                 <w:sz w:val="18"/>
                 <w:szCs w:val="18"/>
               </w:rPr>
-              <w:t xml:space="preserve">Source 1 (confirm) → NHD-600-TX</w:t>
+              <w:t xml:space="preserve">Source 1 (confirm) → NHD-600-E-TX</w:t>
             </w:r>
           </w:p>
         </w:tc>
@@ -6007,7 +6007,7 @@
                 <w:sz w:val="18"/>
                 <w:szCs w:val="18"/>
               </w:rPr>
-              <w:t xml:space="preserve">Source 2 (confirm) → NHD-600-TX</w:t>
+              <w:t xml:space="preserve">Source 2 (confirm) → NHD-600-E-TX</w:t>
             </w:r>
           </w:p>
         </w:tc>
@@ -6170,7 +6170,7 @@
                 <w:sz w:val="18"/>
                 <w:szCs w:val="18"/>
               </w:rPr>
-              <w:t xml:space="preserve">NHD-600-TX → Network switch</w:t>
+              <w:t xml:space="preserve">NHD-600-E-TX → Network switch</w:t>
             </w:r>
           </w:p>
         </w:tc>
@@ -6333,7 +6333,7 @@
                 <w:sz w:val="18"/>
                 <w:szCs w:val="18"/>
               </w:rPr>
-              <w:t xml:space="preserve">NHD-600-TX → Network switch</w:t>
+              <w:t xml:space="preserve">NHD-600-E-TX → Network switch</w:t>
             </w:r>
           </w:p>
         </w:tc>
@@ -6496,7 +6496,7 @@
                 <w:sz w:val="18"/>
                 <w:szCs w:val="18"/>
               </w:rPr>
-              <w:t xml:space="preserve">Network switch → NHD-600-RX</w:t>
+              <w:t xml:space="preserve">Network switch → NHD-600-E-RX</w:t>
             </w:r>
           </w:p>
         </w:tc>
@@ -6659,7 +6659,7 @@
                 <w:sz w:val="18"/>
                 <w:szCs w:val="18"/>
               </w:rPr>
-              <w:t xml:space="preserve">Network switch → NHD-600-RX</w:t>
+              <w:t xml:space="preserve">Network switch → NHD-600-E-RX</w:t>
             </w:r>
           </w:p>
         </w:tc>
@@ -6822,7 +6822,7 @@
                 <w:sz w:val="18"/>
                 <w:szCs w:val="18"/>
               </w:rPr>
-              <w:t xml:space="preserve">Network switch → NHD-600-RX</w:t>
+              <w:t xml:space="preserve">Network switch → NHD-600-E-RX</w:t>
             </w:r>
           </w:p>
         </w:tc>
@@ -6985,7 +6985,7 @@
                 <w:sz w:val="18"/>
                 <w:szCs w:val="18"/>
               </w:rPr>
-              <w:t xml:space="preserve">Network switch → NHD-600-RX</w:t>
+              <w:t xml:space="preserve">Network switch → NHD-600-E-RX</w:t>
             </w:r>
           </w:p>
         </w:tc>
@@ -7311,7 +7311,7 @@
                 <w:sz w:val="18"/>
                 <w:szCs w:val="18"/>
               </w:rPr>
-              <w:t xml:space="preserve">NHD-600-RX → Display 1 (confirm)</w:t>
+              <w:t xml:space="preserve">NHD-600-E-RX → Display 1 (confirm)</w:t>
             </w:r>
           </w:p>
         </w:tc>
@@ -7474,7 +7474,7 @@
                 <w:sz w:val="18"/>
                 <w:szCs w:val="18"/>
               </w:rPr>
-              <w:t xml:space="preserve">NHD-600-RX → Display 2 (confirm)</w:t>
+              <w:t xml:space="preserve">NHD-600-E-RX → Display 2 (confirm)</w:t>
             </w:r>
           </w:p>
         </w:tc>
@@ -7637,7 +7637,7 @@
                 <w:sz w:val="18"/>
                 <w:szCs w:val="18"/>
               </w:rPr>
-              <w:t xml:space="preserve">NHD-600-RX → Display 3 (confirm)</w:t>
+              <w:t xml:space="preserve">NHD-600-E-RX → Display 3 (confirm)</w:t>
             </w:r>
           </w:p>
         </w:tc>
@@ -7800,7 +7800,7 @@
                 <w:sz w:val="18"/>
                 <w:szCs w:val="18"/>
               </w:rPr>
-              <w:t xml:space="preserve">NHD-600-RX → Display 4 (confirm)</w:t>
+              <w:t xml:space="preserve">NHD-600-E-RX → Display 4 (confirm)</w:t>
             </w:r>
           </w:p>
         </w:tc>
@@ -8132,7 +8132,7 @@
           <w:sz w:val="26"/>
           <w:szCs w:val="26"/>
         </w:rPr>
-        <w:t xml:space="preserve">NHD-600-TX — NetworkHD 600 encoder</w:t>
+        <w:t xml:space="preserve">NHD-600-E-TX — NetworkHD 600 SDVoE encoder</w:t>
       </w:r>
     </w:p>
     <w:p>
@@ -8192,7 +8192,7 @@
           <w:sz w:val="26"/>
           <w:szCs w:val="26"/>
         </w:rPr>
-        <w:t xml:space="preserve">NHD-600-RX — NetworkHD 600 decoder</w:t>
+        <w:t xml:space="preserve">NHD-600-E-RX — NetworkHD 600 SDVoE decoder</w:t>
       </w:r>
     </w:p>
     <w:p>
@@ -8559,7 +8559,7 @@
                 <w:sz w:val="18"/>
                 <w:szCs w:val="18"/>
               </w:rPr>
-              <w:t xml:space="preserve">NHD-600-TX</w:t>
+              <w:t xml:space="preserve">NHD-600-E-TX</w:t>
             </w:r>
           </w:p>
         </w:tc>
@@ -8666,7 +8666,7 @@
                 <w:sz w:val="18"/>
                 <w:szCs w:val="18"/>
               </w:rPr>
-              <w:t xml:space="preserve">No power figure published</w:t>
+              <w:t xml:space="preserve">802.3at PoE+</w:t>
             </w:r>
           </w:p>
         </w:tc>
@@ -8697,7 +8697,7 @@
                 <w:sz w:val="18"/>
                 <w:szCs w:val="18"/>
               </w:rPr>
-              <w:t xml:space="preserve">NHD-600-RX</w:t>
+              <w:t xml:space="preserve">NHD-600-E-RX</w:t>
             </w:r>
           </w:p>
         </w:tc>
@@ -8804,7 +8804,7 @@
                 <w:sz w:val="18"/>
                 <w:szCs w:val="18"/>
               </w:rPr>
-              <w:t xml:space="preserve">No power figure published</w:t>
+              <w:t xml:space="preserve">802.3at PoE+</w:t>
             </w:r>
           </w:p>
         </w:tc>
@@ -8973,7 +8973,7 @@
           <w:sz w:val="22"/>
           <w:szCs w:val="22"/>
         </w:rPr>
-        <w:t xml:space="preserve">PoE/PoH requirement: NHD-CTL-PRO-V2 — confirm the injector or switch PoE budget covers the total before order.</w:t>
+        <w:t xml:space="preserve">PoE/PoH requirement: NHD-600-E-TX, NHD-600-E-RX, NHD-CTL-PRO-V2 — confirm the injector or switch PoE budget covers the total before order.</w:t>
       </w:r>
     </w:p>
     <w:p>

</xml_diff>

<commit_message>
docs(release-evidence): regenerate the proposal parity sample from the active SKUs
The sample document is generated from the parity fixture, so the successor
SKUs the fixture now quotes belong in the tracked copy: screen HTML, DOCX,
PDF, and the extracted text a reviewer reads side by side, plus the manifest's
quantity keys.

🤖 Generated with Codebuff
Co-Authored-By: Codebuff <noreply@codebuff.com>
</commit_message>
<xml_diff>
--- a/docs/release-evidence/proposal-output-parity/latest/proposal.docx
+++ b/docs/release-evidence/proposal-output-parity/latest/proposal.docx
@@ -408,7 +408,7 @@
                 <w:sz w:val="18"/>
                 <w:szCs w:val="18"/>
               </w:rPr>
-              <w:t xml:space="preserve">2026-10-23T12:40:06.152Z</w:t>
+              <w:t xml:space="preserve">2026-10-24T15:04:49.284Z</w:t>
             </w:r>
           </w:p>
         </w:tc>
@@ -868,7 +868,7 @@
                 <w:sz w:val="18"/>
                 <w:szCs w:val="18"/>
               </w:rPr>
-              <w:t xml:space="preserve">NetworkHD 600 SDVoE encoder</w:t>
+              <w:t xml:space="preserve">NetworkHD 600 encoder</w:t>
             </w:r>
           </w:p>
         </w:tc>
@@ -1193,7 +1193,7 @@
                 <w:sz w:val="18"/>
                 <w:szCs w:val="18"/>
               </w:rPr>
-              <w:t xml:space="preserve">NetworkHD 600 SDVoE decoder</w:t>
+              <w:t xml:space="preserve">NetworkHD 600 decoder</w:t>
             </w:r>
           </w:p>
         </w:tc>
@@ -3668,7 +3668,7 @@
                 <w:sz w:val="18"/>
                 <w:szCs w:val="18"/>
               </w:rPr>
-              <w:t xml:space="preserve">NetworkHD 600 SDVoE encoder</w:t>
+              <w:t xml:space="preserve">NetworkHD 600 encoder</w:t>
             </w:r>
           </w:p>
         </w:tc>
@@ -3832,7 +3832,7 @@
                 <w:sz w:val="18"/>
                 <w:szCs w:val="18"/>
               </w:rPr>
-              <w:t xml:space="preserve">NetworkHD 600 SDVoE decoder</w:t>
+              <w:t xml:space="preserve">NetworkHD 600 decoder</w:t>
             </w:r>
           </w:p>
         </w:tc>
@@ -8132,7 +8132,7 @@
           <w:sz w:val="26"/>
           <w:szCs w:val="26"/>
         </w:rPr>
-        <w:t xml:space="preserve">NHD-600-E-TX — NetworkHD 600 SDVoE encoder</w:t>
+        <w:t xml:space="preserve">NHD-600-E-TX — NetworkHD 600 encoder</w:t>
       </w:r>
     </w:p>
     <w:p>
@@ -8192,7 +8192,7 @@
           <w:sz w:val="26"/>
           <w:szCs w:val="26"/>
         </w:rPr>
-        <w:t xml:space="preserve">NHD-600-E-RX — NetworkHD 600 SDVoE decoder</w:t>
+        <w:t xml:space="preserve">NHD-600-E-RX — NetworkHD 600 decoder</w:t>
       </w:r>
     </w:p>
     <w:p>

</xml_diff>